<commit_message>
Final Write up version
</commit_message>
<xml_diff>
--- a/Final Project - Write Up.docx
+++ b/Final Project - Write Up.docx
@@ -1,40 +1,96 @@
 
 <file path=word/document.xml><?xml version="1.0" encoding="utf-8"?>
-<w:document xmlns:wpc="http://schemas.microsoft.com/office/word/2010/wordprocessingCanvas" xmlns:cx="http://schemas.microsoft.com/office/drawing/2014/chartex" xmlns:cx1="http://schemas.microsoft.com/office/drawing/2015/9/8/chartex" xmlns:cx2="http://schemas.microsoft.com/office/drawing/2015/10/21/chartex" xmlns:cx3="http://schemas.microsoft.com/office/drawing/2016/5/9/chartex" xmlns:cx4="http://schemas.microsoft.com/office/drawing/2016/5/10/chartex" xmlns:cx5="http://schemas.microsoft.com/office/drawing/2016/5/11/chartex" xmlns:cx6="http://schemas.microsoft.com/office/drawing/2016/5/12/chartex" xmlns:cx7="http://schemas.microsoft.com/office/drawing/2016/5/13/chartex" xmlns:cx8="http://schemas.microsoft.com/office/drawing/2016/5/14/chartex" xmlns:mc="http://schemas.openxmlformats.org/markup-compatibility/2006" xmlns:aink="http://schemas.microsoft.com/office/drawing/2016/ink" xmlns:am3d="http://schemas.microsoft.com/office/drawing/2017/model3d" xmlns:o="urn:schemas-microsoft-com:office:office" xmlns:oel="http://schemas.microsoft.com/office/2019/extlst" xmlns:r="http://schemas.openxmlformats.org/officeDocument/2006/relationships" xmlns:m="http://schemas.openxmlformats.org/officeDocument/2006/math" xmlns:v="urn:schemas-microsoft-com:vml" xmlns:wp14="http://schemas.microsoft.com/office/word/2010/wordprocessingDrawing" xmlns:wp="http://schemas.openxmlformats.org/drawingml/2006/wordprocessingDrawing" xmlns:w10="urn:schemas-microsoft-com:office:word" xmlns:w="http://schemas.openxmlformats.org/wordprocessingml/2006/main" xmlns:w14="http://schemas.microsoft.com/office/word/2010/wordml" xmlns:w15="http://schemas.microsoft.com/office/word/2012/wordml" xmlns:w16cex="http://schemas.microsoft.com/office/word/2018/wordml/cex" xmlns:w16cid="http://schemas.microsoft.com/office/word/2016/wordml/cid" xmlns:w16="http://schemas.microsoft.com/office/word/2018/wordml" xmlns:w16du="http://schemas.microsoft.com/office/word/2023/wordml/word16du" xmlns:w16sdtdh="http://schemas.microsoft.com/office/word/2020/wordml/sdtdatahash" xmlns:w16se="http://schemas.microsoft.com/office/word/2015/wordml/symex" xmlns:wpg="http://schemas.microsoft.com/office/word/2010/wordprocessingGroup" xmlns:wpi="http://schemas.microsoft.com/office/word/2010/wordprocessingInk" xmlns:wne="http://schemas.microsoft.com/office/word/2006/wordml" xmlns:wps="http://schemas.microsoft.com/office/word/2010/wordprocessingShape" mc:Ignorable="w14 w15 w16se w16cid w16 w16cex w16sdtdh w16du wp14">
+<w:document xmlns:wpc="http://schemas.microsoft.com/office/word/2010/wordprocessingCanvas" xmlns:cx="http://schemas.microsoft.com/office/drawing/2014/chartex" xmlns:cx1="http://schemas.microsoft.com/office/drawing/2015/9/8/chartex" xmlns:cx2="http://schemas.microsoft.com/office/drawing/2015/10/21/chartex" xmlns:cx3="http://schemas.microsoft.com/office/drawing/2016/5/9/chartex" xmlns:cx4="http://schemas.microsoft.com/office/drawing/2016/5/10/chartex" xmlns:cx5="http://schemas.microsoft.com/office/drawing/2016/5/11/chartex" xmlns:cx6="http://schemas.microsoft.com/office/drawing/2016/5/12/chartex" xmlns:cx7="http://schemas.microsoft.com/office/drawing/2016/5/13/chartex" xmlns:cx8="http://schemas.microsoft.com/office/drawing/2016/5/14/chartex" xmlns:mc="http://schemas.openxmlformats.org/markup-compatibility/2006" xmlns:aink="http://schemas.microsoft.com/office/drawing/2016/ink" xmlns:am3d="http://schemas.microsoft.com/office/drawing/2017/model3d" xmlns:o="urn:schemas-microsoft-com:office:office" xmlns:oel="http://schemas.microsoft.com/office/2019/extlst" xmlns:r="http://schemas.openxmlformats.org/officeDocument/2006/relationships" xmlns:m="http://schemas.openxmlformats.org/officeDocument/2006/math" xmlns:v="urn:schemas-microsoft-com:vml" xmlns:wp14="http://schemas.microsoft.com/office/word/2010/wordprocessingDrawing" xmlns:wp="http://schemas.openxmlformats.org/drawingml/2006/wordprocessingDrawing" xmlns:w10="urn:schemas-microsoft-com:office:word" xmlns:w="http://schemas.openxmlformats.org/wordprocessingml/2006/main" xmlns:w14="http://schemas.microsoft.com/office/word/2010/wordml" xmlns:w15="http://schemas.microsoft.com/office/word/2012/wordml" xmlns:w16cex="http://schemas.microsoft.com/office/word/2018/wordml/cex" xmlns:w16cid="http://schemas.microsoft.com/office/word/2016/wordml/cid" xmlns:w16="http://schemas.microsoft.com/office/word/2018/wordml" xmlns:w16du="http://schemas.microsoft.com/office/word/2023/wordml/word16du" xmlns:w16sdtdh="http://schemas.microsoft.com/office/word/2020/wordml/sdtdatahash" xmlns:w16sdtfl="http://schemas.microsoft.com/office/word/2024/wordml/sdtformatlock" xmlns:w16se="http://schemas.microsoft.com/office/word/2015/wordml/symex" xmlns:wpg="http://schemas.microsoft.com/office/word/2010/wordprocessingGroup" xmlns:wpi="http://schemas.microsoft.com/office/word/2010/wordprocessingInk" xmlns:wne="http://schemas.microsoft.com/office/word/2006/wordml" xmlns:wps="http://schemas.microsoft.com/office/word/2010/wordprocessingShape" mc:Ignorable="w14 w15 w16se w16cid w16 w16cex w16sdtdh w16sdtfl w16du wp14">
   <w:body>
     <w:p>
       <w:pPr>
-        <w:pStyle w:val="Heading1"/>
         <w:jc w:val="center"/>
-      </w:pPr>
-      <w:r>
+        <w:rPr>
+          <w:b/>
+          <w:bCs/>
+          <w:sz w:val="34"/>
+          <w:szCs w:val="34"/>
+        </w:rPr>
+      </w:pPr>
+      <w:r>
+        <w:rPr>
+          <w:b/>
+          <w:bCs/>
+          <w:sz w:val="34"/>
+          <w:szCs w:val="34"/>
+        </w:rPr>
         <w:t xml:space="preserve">Descriptive </w:t>
       </w:r>
       <w:r>
+        <w:rPr>
+          <w:b/>
+          <w:bCs/>
+          <w:sz w:val="34"/>
+          <w:szCs w:val="34"/>
+        </w:rPr>
         <w:t>Analysis of</w:t>
       </w:r>
       <w:r>
+        <w:rPr>
+          <w:b/>
+          <w:bCs/>
+          <w:sz w:val="34"/>
+          <w:szCs w:val="34"/>
+        </w:rPr>
         <w:t xml:space="preserve"> Persist</w:t>
       </w:r>
       <w:r>
+        <w:rPr>
+          <w:b/>
+          <w:bCs/>
+          <w:sz w:val="34"/>
+          <w:szCs w:val="34"/>
+        </w:rPr>
         <w:t>ing Effects of</w:t>
       </w:r>
       <w:r>
+        <w:rPr>
+          <w:b/>
+          <w:bCs/>
+          <w:sz w:val="34"/>
+          <w:szCs w:val="34"/>
+        </w:rPr>
         <w:t xml:space="preserve"> the Berlin Division</w:t>
       </w:r>
       <w:r>
+        <w:rPr>
+          <w:b/>
+          <w:bCs/>
+          <w:sz w:val="34"/>
+          <w:szCs w:val="34"/>
+        </w:rPr>
         <w:t xml:space="preserve"> </w:t>
       </w:r>
       <w:r>
-        <w:t xml:space="preserve">                 </w:t>
-      </w:r>
-      <w:r>
+        <w:rPr>
+          <w:b/>
+          <w:bCs/>
+          <w:sz w:val="34"/>
+          <w:szCs w:val="34"/>
+        </w:rPr>
         <w:t xml:space="preserve">on </w:t>
       </w:r>
       <w:r>
+        <w:rPr>
+          <w:b/>
+          <w:bCs/>
+          <w:sz w:val="34"/>
+          <w:szCs w:val="34"/>
+        </w:rPr>
         <w:t>Airbnb</w:t>
       </w:r>
       <w:r>
+        <w:rPr>
+          <w:b/>
+          <w:bCs/>
+          <w:sz w:val="34"/>
+          <w:szCs w:val="34"/>
+        </w:rPr>
         <w:t xml:space="preserve"> Markets</w:t>
       </w:r>
     </w:p>
@@ -71,304 +127,216 @@
       </w:r>
     </w:p>
     <w:p/>
+    <w:p>
+      <w:pPr>
+        <w:pStyle w:val="Heading2"/>
+      </w:pPr>
+      <w:r>
+        <w:t>Background</w:t>
+      </w:r>
+    </w:p>
     <w:p/>
     <w:p>
+      <w:r>
+        <w:t>Following the end of the Second World War in 1945, Germany was divided into two separate states. The western portion of the country became the Federal Republic of Germany (FRG) under the influence and administration of the United States, the United Kingdom, and France, while the eastern portion, known as the German Democratic Republic (GDR), was placed under Soviet control</w:t>
+      </w:r>
+      <w:r>
+        <w:t xml:space="preserve">. </w:t>
+      </w:r>
+      <w:r>
+        <w:t>The capital city of Berlin, although located entirely within the territory of the GDR, was similarly partitioned among the four Allied powers, resulting in a divided city emblematic of the emerging Cold War tensions.</w:t>
+      </w:r>
+    </w:p>
+    <w:p>
+      <w:r>
+        <w:t>By 1961, significant numbers of East Germans—approximately 20% of the GDR's population—had migrated to West Germany, seeking political freedom and economic opportunity</w:t>
+      </w:r>
+      <w:r>
+        <w:t xml:space="preserve">. </w:t>
+      </w:r>
+      <w:r>
+        <w:t>In response, the East German government, with Soviet backing, constructed the Berlin Wall in August 1961 to physically and ideologically separate East Berlin from West Berlin and prevent more migration west</w:t>
+      </w:r>
+      <w:r>
+        <w:t xml:space="preserve">. </w:t>
+      </w:r>
+      <w:r>
+        <w:t>The Wall quickly became a symbol of the Cold War, often referred to as the Iron Curtain.</w:t>
+      </w:r>
+    </w:p>
+    <w:p>
+      <w:r>
+        <w:t>The Berlin Wall fell on November 9, 1989</w:t>
+      </w:r>
+      <w:r>
+        <w:t xml:space="preserve">, signaling a </w:t>
+      </w:r>
+      <w:r>
+        <w:t>changing tide in geopolitics. Nevertheless, the consequences of this division—and the transition from a centrally planned economy to a market-based system—were neither immediate nor uniform. Economic disparities, social tensions, and political challenges persisted in the post-reunification period, underscoring the complex and uneven nature of this historic transformation (Jarausch, 2010).</w:t>
+      </w:r>
+      <w:r>
+        <w:t xml:space="preserve"> Many researchers have investigated this phenomenon across multiple </w:t>
+      </w:r>
+      <w:r>
+        <w:t>dimensions,</w:t>
+      </w:r>
+      <w:r>
+        <w:t xml:space="preserve"> generally finding there is a persisting effect of the Berlin division on </w:t>
+      </w:r>
+      <w:r>
+        <w:t>household income, wealth,</w:t>
+      </w:r>
+      <w:r>
+        <w:t xml:space="preserve"> and other </w:t>
+      </w:r>
+      <w:r>
+        <w:t>sociodemographic</w:t>
+      </w:r>
+      <w:r>
+        <w:t xml:space="preserve"> in Germany</w:t>
+      </w:r>
+      <w:r>
+        <w:t xml:space="preserve"> (</w:t>
+      </w:r>
+      <w:proofErr w:type="spellStart"/>
+      <w:r>
+        <w:t>Ahfeldt</w:t>
+      </w:r>
+      <w:proofErr w:type="spellEnd"/>
+      <w:r>
+        <w:t xml:space="preserve"> et al (2015); </w:t>
+      </w:r>
+      <w:r>
+        <w:t>Burchardi and Hassan (2011)</w:t>
+      </w:r>
+      <w:r>
+        <w:t xml:space="preserve">; </w:t>
+      </w:r>
+      <w:proofErr w:type="spellStart"/>
+      <w:r>
+        <w:t>Kottasova</w:t>
+      </w:r>
+      <w:proofErr w:type="spellEnd"/>
+      <w:r>
+        <w:t xml:space="preserve"> and Croker (2019)</w:t>
+      </w:r>
+      <w:r>
+        <w:t>)</w:t>
+      </w:r>
+    </w:p>
+    <w:p>
+      <w:r>
+        <w:t>This study asks whether such persistent effects of the Berlin Division are also evident in the Airbnb market.</w:t>
+      </w:r>
+      <w:r>
+        <w:t xml:space="preserve"> </w:t>
+      </w:r>
+      <w:r>
+        <w:t xml:space="preserve">We </w:t>
+      </w:r>
+      <w:r>
+        <w:t>hypothesize</w:t>
+      </w:r>
+      <w:r>
+        <w:t xml:space="preserve"> that tourists, those renting Airbnbs,</w:t>
+      </w:r>
+      <w:r>
+        <w:t xml:space="preserve"> who</w:t>
+      </w:r>
+      <w:r>
+        <w:t xml:space="preserve"> choose a location near the Berlin division, are locating there to see the site of the Berlin division</w:t>
+      </w:r>
+      <w:r>
+        <w:t>. Thus,</w:t>
+      </w:r>
+      <w:r>
+        <w:t xml:space="preserve"> perhaps</w:t>
+      </w:r>
+      <w:r>
+        <w:t xml:space="preserve"> tourists</w:t>
+      </w:r>
+      <w:r>
+        <w:t xml:space="preserve"> should </w:t>
+      </w:r>
+      <w:r>
+        <w:t>be</w:t>
+      </w:r>
+      <w:r>
+        <w:t xml:space="preserve"> marginally indifferent between an Airbnb in East</w:t>
+      </w:r>
+      <w:r>
+        <w:t xml:space="preserve"> </w:t>
+      </w:r>
+      <w:r>
+        <w:t>or West</w:t>
+      </w:r>
+      <w:r>
+        <w:t xml:space="preserve"> </w:t>
+      </w:r>
+      <w:r>
+        <w:t xml:space="preserve">Berlin. </w:t>
+      </w:r>
+      <w:r>
+        <w:t xml:space="preserve">Implying there should be </w:t>
+      </w:r>
+      <w:r>
+        <w:t xml:space="preserve">minimal </w:t>
+      </w:r>
+      <w:r>
+        <w:t xml:space="preserve">persistent effects in the Airbnb market that </w:t>
+      </w:r>
+      <w:r>
+        <w:t>are not already</w:t>
+      </w:r>
+      <w:r>
+        <w:t xml:space="preserve"> explained by long</w:t>
+      </w:r>
+      <w:r>
+        <w:t xml:space="preserve">er differing household-level </w:t>
+      </w:r>
+      <w:r>
+        <w:t>trends</w:t>
+      </w:r>
+      <w:r>
+        <w:t xml:space="preserve"> between East and West Berlin</w:t>
+      </w:r>
+      <w:r>
+        <w:t xml:space="preserve">. </w:t>
+      </w:r>
+      <w:r>
+        <w:t xml:space="preserve">Further, Airbnb is just over a decade old. </w:t>
+      </w:r>
+      <w:r>
+        <w:t>To explore this question, we compare descriptive characteristics of Airbnb listings in East and West Berlin to investigate whether any persistent effects of the Berlin Division remain observable in this contemporary market.</w:t>
+      </w:r>
+    </w:p>
+    <w:p>
       <w:pPr>
         <w:pStyle w:val="Heading2"/>
       </w:pPr>
       <w:r>
-        <w:t>Background</w:t>
-      </w:r>
-    </w:p>
-    <w:p>
-      <w:r>
-        <w:t>Following the end of the Second World War in 1945, Germany was divided into two separate states. The western portion of the country became the Federal Republic of Germany (FRG) under the influence and administration of the United States, the United Kingdom, and France, while the eastern portion, known as the German Democratic Republic (GDR), was placed under Soviet control</w:t>
-      </w:r>
-      <w:r>
-        <w:t xml:space="preserve">. </w:t>
-      </w:r>
-      <w:r>
-        <w:t>The capital city of Berlin, although located entirely within the territory of the GDR, was similarly partitioned among the four Allied powers, resulting in a divided city emblematic of the emerging Cold War tensions.</w:t>
-      </w:r>
-    </w:p>
-    <w:p>
-      <w:pPr>
-        <w:ind w:firstLine="720"/>
-      </w:pPr>
-      <w:r>
-        <w:t>By 1961, significant numbers of East Germans—approximately 20% of the GDR's population—had migrated to West Germany, seeking political freedom and economic opportunity</w:t>
-      </w:r>
-      <w:r>
-        <w:t xml:space="preserve">. </w:t>
-      </w:r>
-      <w:r>
-        <w:t>In response, the East German government, with Soviet backing, constructed the Berlin Wall in August 1961 to physically and ideologically separate East Berlin from West Berlin and prevent more migration west</w:t>
-      </w:r>
-      <w:r>
-        <w:t xml:space="preserve">. </w:t>
-      </w:r>
-      <w:r>
-        <w:t>The Wall quickly became a symbol of the Cold War, often referred to as the Iron Curtain.</w:t>
-      </w:r>
-    </w:p>
-    <w:p>
-      <w:pPr>
-        <w:ind w:firstLine="720"/>
-      </w:pPr>
-      <w:r>
-        <w:t>The Berlin Wall fell on November 9, 1989</w:t>
-      </w:r>
-      <w:r>
-        <w:t xml:space="preserve">, signaling a </w:t>
-      </w:r>
-      <w:r>
-        <w:t>changing tide in geopolitics. Nevertheless, the consequences of this division—and the transition from a centrally planned economy to a market-based system—were neither immediate nor uniform. Economic disparities, social tensions, and political challenges persisted in the post-reunification period, underscoring the complex and uneven nature of this historic transformation (Jarausch, 2010).</w:t>
-      </w:r>
-      <w:r>
-        <w:t xml:space="preserve"> Many researchers have investigated this phenomenon across multiple </w:t>
-      </w:r>
-      <w:proofErr w:type="gramStart"/>
-      <w:r>
-        <w:t>dimensions</w:t>
-      </w:r>
-      <w:r>
-        <w:t xml:space="preserve"> ,</w:t>
-      </w:r>
-      <w:proofErr w:type="gramEnd"/>
-      <w:r>
-        <w:t xml:space="preserve"> generally finding there is a persisting effect of the Berlin division on </w:t>
-      </w:r>
-      <w:r>
-        <w:t>household income, wealth,</w:t>
-      </w:r>
-      <w:r>
-        <w:t xml:space="preserve"> and other </w:t>
-      </w:r>
-      <w:proofErr w:type="spellStart"/>
-      <w:r>
-        <w:t>sociodemographics</w:t>
-      </w:r>
-      <w:proofErr w:type="spellEnd"/>
-      <w:r>
-        <w:t xml:space="preserve"> in Germany</w:t>
-      </w:r>
-      <w:r>
-        <w:t xml:space="preserve"> (</w:t>
-      </w:r>
-      <w:proofErr w:type="spellStart"/>
-      <w:r>
-        <w:t>Ahfeldt</w:t>
-      </w:r>
-      <w:proofErr w:type="spellEnd"/>
-      <w:r>
-        <w:t xml:space="preserve"> et al (2015); </w:t>
-      </w:r>
-      <w:r>
-        <w:t>Burchardi and Hassan (2011)</w:t>
-      </w:r>
-      <w:r>
-        <w:t xml:space="preserve">; </w:t>
-      </w:r>
-      <w:proofErr w:type="spellStart"/>
-      <w:r>
-        <w:rPr>
-          <w:sz w:val="24"/>
-          <w:szCs w:val="24"/>
-        </w:rPr>
-        <w:t>Kottasova</w:t>
-      </w:r>
-      <w:proofErr w:type="spellEnd"/>
-      <w:r>
-        <w:rPr>
-          <w:sz w:val="24"/>
-          <w:szCs w:val="24"/>
-        </w:rPr>
+        <w:lastRenderedPageBreak/>
+        <w:t>Data</w:t>
+      </w:r>
+    </w:p>
+    <w:p>
+      <w:pPr>
+        <w:spacing w:before="100" w:beforeAutospacing="1" w:after="100" w:afterAutospacing="1"/>
+      </w:pPr>
+      <w:r>
+        <w:t xml:space="preserve">We use publicly available data from </w:t>
+      </w:r>
+      <w:r>
+        <w:t>Inside Airbnb</w:t>
+      </w:r>
+      <w:r>
+        <w:t>, an independent project that provides insights into the short-term rental market. While the platform offers rich data for research, it is important to acknowledge that Inside Airbnb is a mission-driven and advocacy-oriented initiative. As stated on their website:</w:t>
+      </w:r>
+      <w:r>
         <w:t xml:space="preserve"> </w:t>
       </w:r>
       <w:r>
-        <w:rPr>
-          <w:sz w:val="24"/>
-          <w:szCs w:val="24"/>
-        </w:rPr>
-        <w:t>and</w:t>
-      </w:r>
-      <w:r>
-        <w:rPr>
-          <w:sz w:val="24"/>
-          <w:szCs w:val="24"/>
-        </w:rPr>
-        <w:t xml:space="preserve"> Croker</w:t>
-      </w:r>
-      <w:r>
-        <w:rPr>
-          <w:sz w:val="24"/>
-          <w:szCs w:val="24"/>
-        </w:rPr>
-        <w:t xml:space="preserve"> (2019)</w:t>
-      </w:r>
-      <w:r>
-        <w:t>)</w:t>
-      </w:r>
-    </w:p>
-    <w:p>
-      <w:pPr>
-        <w:ind w:firstLine="720"/>
-      </w:pPr>
-      <w:r>
-        <w:t>We ask, are there p</w:t>
-      </w:r>
-      <w:r>
-        <w:t xml:space="preserve">ersisting </w:t>
-      </w:r>
-      <w:r>
-        <w:t>e</w:t>
-      </w:r>
-      <w:r>
-        <w:t xml:space="preserve">ffects of the Berlin Division on Airbnb </w:t>
-      </w:r>
-      <w:r>
-        <w:t>m</w:t>
-      </w:r>
-      <w:r>
-        <w:t>arkets</w:t>
-      </w:r>
-      <w:r>
-        <w:t xml:space="preserve">? </w:t>
-      </w:r>
-      <w:r>
-        <w:t xml:space="preserve">We </w:t>
-      </w:r>
-      <w:r>
-        <w:t>hypothesize</w:t>
-      </w:r>
-      <w:r>
-        <w:t xml:space="preserve"> that tourists, those renting Airbnbs,</w:t>
-      </w:r>
-      <w:r>
-        <w:t xml:space="preserve"> who</w:t>
-      </w:r>
-      <w:r>
-        <w:t xml:space="preserve"> choose a location near the Berlin division, are locating there to see the site of the Berlin division</w:t>
-      </w:r>
-      <w:r>
-        <w:t>. Thus,</w:t>
-      </w:r>
-      <w:r>
-        <w:t xml:space="preserve"> perhaps</w:t>
-      </w:r>
-      <w:r>
-        <w:t xml:space="preserve"> tourists</w:t>
-      </w:r>
-      <w:r>
-        <w:t xml:space="preserve"> should </w:t>
-      </w:r>
-      <w:r>
-        <w:t>be</w:t>
-      </w:r>
-      <w:r>
-        <w:t xml:space="preserve"> marginally indifferent between an Airbnb in East</w:t>
-      </w:r>
-      <w:r>
-        <w:t xml:space="preserve"> </w:t>
-      </w:r>
-      <w:r>
-        <w:t>or West</w:t>
-      </w:r>
-      <w:r>
-        <w:t xml:space="preserve"> </w:t>
-      </w:r>
-      <w:r>
-        <w:t xml:space="preserve">Berlin. </w:t>
-      </w:r>
-      <w:r>
-        <w:t xml:space="preserve">Implying there should be </w:t>
-      </w:r>
-      <w:r>
-        <w:t xml:space="preserve">minimal </w:t>
-      </w:r>
-      <w:r>
-        <w:t xml:space="preserve">persistent effects in the Airbnb market that </w:t>
-      </w:r>
-      <w:r>
-        <w:t>are not already</w:t>
-      </w:r>
-      <w:r>
-        <w:t xml:space="preserve"> explained by long</w:t>
-      </w:r>
-      <w:r>
-        <w:t xml:space="preserve">er differing household-level </w:t>
-      </w:r>
-      <w:r>
-        <w:t>trends</w:t>
-      </w:r>
-      <w:r>
-        <w:t xml:space="preserve"> between East and West Berlin</w:t>
-      </w:r>
-      <w:r>
-        <w:t xml:space="preserve">. </w:t>
-      </w:r>
-      <w:r>
-        <w:t xml:space="preserve">Further, Airbnb is just over a decade old. </w:t>
-      </w:r>
-      <w:r>
-        <w:t xml:space="preserve">To look into </w:t>
-      </w:r>
-      <w:proofErr w:type="gramStart"/>
-      <w:r>
-        <w:t>this</w:t>
-      </w:r>
-      <w:proofErr w:type="gramEnd"/>
-      <w:r>
-        <w:t xml:space="preserve"> we can compare East and West</w:t>
-      </w:r>
-      <w:r>
-        <w:t xml:space="preserve"> </w:t>
-      </w:r>
-      <w:r>
-        <w:t xml:space="preserve">Berlin characteristics to descriptively indicate persistence effects. Asking, are there Persistent Effects of the Berlin Division in the </w:t>
-      </w:r>
-      <w:r>
-        <w:t>Airbnb</w:t>
-      </w:r>
-      <w:r>
-        <w:t xml:space="preserve"> market?</w:t>
-      </w:r>
-    </w:p>
-    <w:p>
-      <w:pPr>
-        <w:ind w:firstLine="720"/>
-      </w:pPr>
-    </w:p>
-    <w:p>
-      <w:pPr>
-        <w:pStyle w:val="Heading2"/>
-      </w:pPr>
-      <w:r>
-        <w:t>Data</w:t>
-      </w:r>
-    </w:p>
-    <w:p>
-      <w:pPr>
-        <w:spacing w:before="100" w:beforeAutospacing="1" w:after="100" w:afterAutospacing="1"/>
-      </w:pPr>
-      <w:r>
-        <w:t xml:space="preserve">We use publicly available data from </w:t>
-      </w:r>
-      <w:r>
-        <w:t>Inside Airbnb</w:t>
-      </w:r>
-      <w:r>
-        <w:t>, an independent project that provides insights into the short-term rental market. While the platform offers rich data for research, it is important to acknowledge that Inside Airbnb is a mission-driven and advocacy-oriented initiative. As stated on their website:</w:t>
-      </w:r>
-      <w:r>
-        <w:t xml:space="preserve"> </w:t>
-      </w:r>
-      <w:r>
-        <w:t xml:space="preserve">“Inside </w:t>
-      </w:r>
-      <w:r>
-        <w:lastRenderedPageBreak/>
-        <w:t>Airbnb is a mission driven project that provides data and advocacy about Airbnb's impact on residential communities. We support residents and activists who are organizing to protect their communities from the negative effects of short-term rentals.”</w:t>
+        <w:t>“Inside Airbnb is a mission driven project that provides data and advocacy about Airbnb's impact on residential communities. We support residents and activists who are organizing to protect their communities from the negative effects of short-term rentals.”</w:t>
       </w:r>
       <w:r>
         <w:t xml:space="preserve"> </w:t>
@@ -440,7 +408,15 @@
         <w:t xml:space="preserve">. Along with a map of the Berlin Wall location, the coordinates </w:t>
       </w:r>
       <w:r>
-        <w:t>allow us to classify each listing as being located in either East or West Berlin. Listings are also assigned to one of Berlin’s 12 boroughs based on their geolocation.</w:t>
+        <w:t xml:space="preserve">allow us to classify each listing as </w:t>
+      </w:r>
+      <w:proofErr w:type="gramStart"/>
+      <w:r>
+        <w:t>being located in</w:t>
+      </w:r>
+      <w:proofErr w:type="gramEnd"/>
+      <w:r>
+        <w:t xml:space="preserve"> either East or West Berlin. Listings are also assigned to one of Berlin’s 12 boroughs based on their geolocation.</w:t>
       </w:r>
       <w:r>
         <w:t xml:space="preserve"> Berlin is administratively divided into 12 boroughs: six located in the former West Berlin, four in the former East Berlin, and </w:t>
@@ -534,239 +510,132 @@
     </w:p>
     <w:p>
       <w:pPr>
-        <w:spacing w:before="100" w:beforeAutospacing="1" w:after="100" w:afterAutospacing="1"/>
-      </w:pPr>
-    </w:p>
-    <w:tbl>
-      <w:tblPr>
-        <w:tblStyle w:val="TableGrid"/>
-        <w:tblW w:w="0" w:type="auto"/>
-        <w:tblBorders>
-          <w:top w:val="none" w:sz="0" w:space="0" w:color="auto"/>
-          <w:left w:val="none" w:sz="0" w:space="0" w:color="auto"/>
-          <w:bottom w:val="none" w:sz="0" w:space="0" w:color="auto"/>
-          <w:right w:val="none" w:sz="0" w:space="0" w:color="auto"/>
-          <w:insideH w:val="none" w:sz="0" w:space="0" w:color="auto"/>
-          <w:insideV w:val="none" w:sz="0" w:space="0" w:color="auto"/>
-        </w:tblBorders>
-        <w:tblLook w:val="04A0" w:firstRow="1" w:lastRow="0" w:firstColumn="1" w:lastColumn="0" w:noHBand="0" w:noVBand="1"/>
-      </w:tblPr>
-      <w:tblGrid>
-        <w:gridCol w:w="9546"/>
-      </w:tblGrid>
-      <w:tr>
-        <w:trPr>
-          <w:trHeight w:val="4310"/>
-        </w:trPr>
-        <w:tc>
-          <w:tcPr>
-            <w:tcW w:w="9546" w:type="dxa"/>
-          </w:tcPr>
-          <w:p>
-            <w:r>
-              <w:rPr>
-                <w:noProof/>
-              </w:rPr>
-              <w:lastRenderedPageBreak/>
-              <w:drawing>
-                <wp:anchor distT="0" distB="0" distL="114300" distR="114300" simplePos="0" relativeHeight="251657216" behindDoc="0" locked="0" layoutInCell="1" allowOverlap="1" wp14:anchorId="3D642E14" wp14:editId="0D4206DD">
-                  <wp:simplePos x="0" y="0"/>
-                  <wp:positionH relativeFrom="column">
-                    <wp:posOffset>-68580</wp:posOffset>
-                  </wp:positionH>
-                  <wp:positionV relativeFrom="paragraph">
-                    <wp:posOffset>0</wp:posOffset>
-                  </wp:positionV>
-                  <wp:extent cx="5920740" cy="4703445"/>
-                  <wp:effectExtent l="0" t="0" r="3810" b="1905"/>
-                  <wp:wrapSquare wrapText="bothSides"/>
-                  <wp:docPr id="1125363072" name="Picture 1" descr="A map of a city&#10;&#10;AI-generated content may be incorrect."/>
-                  <wp:cNvGraphicFramePr>
-                    <a:graphicFrameLocks xmlns:a="http://schemas.openxmlformats.org/drawingml/2006/main" noChangeAspect="1"/>
-                  </wp:cNvGraphicFramePr>
-                  <a:graphic xmlns:a="http://schemas.openxmlformats.org/drawingml/2006/main">
-                    <a:graphicData uri="http://schemas.openxmlformats.org/drawingml/2006/picture">
-                      <pic:pic xmlns:pic="http://schemas.openxmlformats.org/drawingml/2006/picture">
-                        <pic:nvPicPr>
-                          <pic:cNvPr id="1125363072" name="Picture 1" descr="A map of a city&#10;&#10;AI-generated content may be incorrect."/>
-                          <pic:cNvPicPr/>
-                        </pic:nvPicPr>
-                        <pic:blipFill rotWithShape="1">
-                          <a:blip r:embed="rId8" cstate="print">
-                            <a:extLst>
-                              <a:ext uri="{28A0092B-C50C-407E-A947-70E740481C1C}">
-                                <a14:useLocalDpi xmlns:a14="http://schemas.microsoft.com/office/drawing/2010/main" val="0"/>
-                              </a:ext>
-                            </a:extLst>
-                          </a:blip>
-                          <a:srcRect l="14288" t="20879" r="11704" b="20330"/>
-                          <a:stretch/>
-                        </pic:blipFill>
-                        <pic:spPr bwMode="auto">
-                          <a:xfrm>
-                            <a:off x="0" y="0"/>
-                            <a:ext cx="5920740" cy="4703445"/>
-                          </a:xfrm>
-                          <a:prstGeom prst="rect">
-                            <a:avLst/>
-                          </a:prstGeom>
-                          <a:ln>
-                            <a:noFill/>
-                          </a:ln>
-                          <a:extLst>
-                            <a:ext uri="{53640926-AAD7-44D8-BBD7-CCE9431645EC}">
-                              <a14:shadowObscured xmlns:a14="http://schemas.microsoft.com/office/drawing/2010/main"/>
-                            </a:ext>
-                          </a:extLst>
-                        </pic:spPr>
-                      </pic:pic>
-                    </a:graphicData>
-                  </a:graphic>
-                  <wp14:sizeRelH relativeFrom="page">
-                    <wp14:pctWidth>0</wp14:pctWidth>
-                  </wp14:sizeRelH>
-                  <wp14:sizeRelV relativeFrom="page">
-                    <wp14:pctHeight>0</wp14:pctHeight>
-                  </wp14:sizeRelV>
-                </wp:anchor>
-              </w:drawing>
-            </w:r>
-            <w:r>
-              <w:rPr>
-                <w:noProof/>
-              </w:rPr>
-              <w:pict w14:anchorId="790B0E5D">
-                <v:shapetype id="_x0000_t202" coordsize="21600,21600" o:spt="202" path="m,l,21600r21600,l21600,xe">
-                  <v:stroke joinstyle="miter"/>
-                  <v:path gradientshapeok="t" o:connecttype="rect"/>
-                </v:shapetype>
-                <v:shape id="Text Box 1" o:spid="_x0000_s1026" type="#_x0000_t202" style="position:absolute;margin-left:-5.4pt;margin-top:0;width:364.75pt;height:36pt;z-index:251660288;visibility:visible;mso-wrap-style:square;mso-wrap-distance-left:9pt;mso-wrap-distance-top:0;mso-wrap-distance-right:9pt;mso-wrap-distance-bottom:0;mso-position-horizontal:absolute;mso-position-horizontal-relative:text;mso-position-vertical:absolute;mso-position-vertical-relative:text;v-text-anchor:top" o:gfxdata="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" stroked="f">
-                  <v:textbox inset="0,0,0,0">
-                    <w:txbxContent>
-                      <w:p>
-                        <w:pPr>
-                          <w:pStyle w:val="Caption"/>
-                          <w:rPr>
-                            <w:noProof/>
-                          </w:rPr>
-                        </w:pPr>
-                        <w:r>
-                          <w:t xml:space="preserve">Figure </w:t>
-                        </w:r>
-                        <w:fldSimple w:instr=" SEQ Figure \* ARABIC ">
-                          <w:r>
-                            <w:rPr>
-                              <w:noProof/>
-                            </w:rPr>
-                            <w:t>1</w:t>
-                          </w:r>
-                        </w:fldSimple>
-                        <w:r>
-                          <w:t>. East and West-Berlin Airbnb Locations by Neighborhood</w:t>
-                        </w:r>
-                      </w:p>
-                    </w:txbxContent>
-                  </v:textbox>
-                  <w10:wrap type="square"/>
-                </v:shape>
-              </w:pict>
-            </w:r>
-          </w:p>
-        </w:tc>
-      </w:tr>
-    </w:tbl>
-    <w:p>
-      <w:pPr>
         <w:pStyle w:val="Caption"/>
-        <w:keepNext/>
-        <w:ind w:firstLine="720"/>
-        <w:rPr>
-          <w:i w:val="0"/>
-          <w:iCs w:val="0"/>
-          <w:color w:val="auto"/>
-          <w:sz w:val="22"/>
-          <w:szCs w:val="22"/>
-        </w:rPr>
-      </w:pPr>
-      <w:r>
-        <w:rPr>
-          <w:i w:val="0"/>
-          <w:iCs w:val="0"/>
-          <w:color w:val="auto"/>
-          <w:sz w:val="22"/>
-          <w:szCs w:val="22"/>
-        </w:rPr>
+        <w:rPr>
+          <w:noProof/>
+        </w:rPr>
+      </w:pPr>
+      <w:r>
+        <w:lastRenderedPageBreak/>
+        <w:t xml:space="preserve">Figure </w:t>
+      </w:r>
+      <w:r>
+        <w:fldChar w:fldCharType="begin"/>
+      </w:r>
+      <w:r>
+        <w:instrText xml:space="preserve"> SEQ Figure \* ARABIC </w:instrText>
+      </w:r>
+      <w:r>
+        <w:fldChar w:fldCharType="separate"/>
+      </w:r>
+      <w:r>
+        <w:rPr>
+          <w:noProof/>
+        </w:rPr>
+        <w:t>1</w:t>
+      </w:r>
+      <w:r>
+        <w:rPr>
+          <w:noProof/>
+        </w:rPr>
+        <w:fldChar w:fldCharType="end"/>
+      </w:r>
+      <w:r>
+        <w:t>. East and West-Berlin Airbnb Locations by Neighborhood</w:t>
+      </w:r>
+    </w:p>
+    <w:p>
+      <w:pPr>
+        <w:pStyle w:val="Caption"/>
+        <w:jc w:val="center"/>
+      </w:pPr>
+      <w:r>
+        <w:rPr>
+          <w:noProof/>
+        </w:rPr>
+        <w:drawing>
+          <wp:inline distT="0" distB="0" distL="0" distR="0" wp14:anchorId="30FD78F7" wp14:editId="3F291555">
+            <wp:extent cx="4288790" cy="3461557"/>
+            <wp:effectExtent l="0" t="0" r="0" b="0"/>
+            <wp:docPr id="1905048014" name="Picture 2" descr="A map of a city&#10;&#10;AI-generated content may be incorrect."/>
+            <wp:cNvGraphicFramePr>
+              <a:graphicFrameLocks xmlns:a="http://schemas.openxmlformats.org/drawingml/2006/main" noChangeAspect="1"/>
+            </wp:cNvGraphicFramePr>
+            <a:graphic xmlns:a="http://schemas.openxmlformats.org/drawingml/2006/main">
+              <a:graphicData uri="http://schemas.openxmlformats.org/drawingml/2006/picture">
+                <pic:pic xmlns:pic="http://schemas.openxmlformats.org/drawingml/2006/picture">
+                  <pic:nvPicPr>
+                    <pic:cNvPr id="1905048014" name="Picture 2" descr="A map of a city&#10;&#10;AI-generated content may be incorrect."/>
+                    <pic:cNvPicPr/>
+                  </pic:nvPicPr>
+                  <pic:blipFill rotWithShape="1">
+                    <a:blip r:embed="rId8" cstate="print">
+                      <a:extLst>
+                        <a:ext uri="{28A0092B-C50C-407E-A947-70E740481C1C}">
+                          <a14:useLocalDpi xmlns:a14="http://schemas.microsoft.com/office/drawing/2010/main" val="0"/>
+                        </a:ext>
+                      </a:extLst>
+                    </a:blip>
+                    <a:srcRect l="15203" t="21246" r="12636" b="20511"/>
+                    <a:stretch/>
+                  </pic:blipFill>
+                  <pic:spPr bwMode="auto">
+                    <a:xfrm>
+                      <a:off x="0" y="0"/>
+                      <a:ext cx="4288956" cy="3461691"/>
+                    </a:xfrm>
+                    <a:prstGeom prst="rect">
+                      <a:avLst/>
+                    </a:prstGeom>
+                    <a:ln>
+                      <a:noFill/>
+                    </a:ln>
+                    <a:extLst>
+                      <a:ext uri="{53640926-AAD7-44D8-BBD7-CCE9431645EC}">
+                        <a14:shadowObscured xmlns:a14="http://schemas.microsoft.com/office/drawing/2010/main"/>
+                      </a:ext>
+                    </a:extLst>
+                  </pic:spPr>
+                </pic:pic>
+              </a:graphicData>
+            </a:graphic>
+          </wp:inline>
+        </w:drawing>
+      </w:r>
+    </w:p>
+    <w:p>
+      <w:r>
         <w:t xml:space="preserve">Although the total number of Airbnb listings in East and West Berlin is roughly similar, there is variation in listing counts across individual boroughs. </w:t>
       </w:r>
       <w:r>
         <w:rPr>
           <w:b/>
           <w:bCs/>
-          <w:i w:val="0"/>
-          <w:iCs w:val="0"/>
-          <w:color w:val="auto"/>
-          <w:sz w:val="22"/>
-          <w:szCs w:val="22"/>
         </w:rPr>
         <w:t xml:space="preserve">Figure 2 </w:t>
       </w:r>
       <w:r>
-        <w:rPr>
-          <w:i w:val="0"/>
-          <w:iCs w:val="0"/>
-          <w:color w:val="auto"/>
-          <w:sz w:val="22"/>
-          <w:szCs w:val="22"/>
-        </w:rPr>
         <w:t>shows a bar chart displaying the number of listings in each borough, categorized by East and West Berlin. Notably, boroughs Mitte</w:t>
       </w:r>
       <w:r>
-        <w:rPr>
-          <w:i w:val="0"/>
-          <w:iCs w:val="0"/>
-          <w:color w:val="auto"/>
-          <w:sz w:val="22"/>
-          <w:szCs w:val="22"/>
-        </w:rPr>
         <w:t>, Pankow,</w:t>
       </w:r>
       <w:r>
-        <w:rPr>
-          <w:i w:val="0"/>
-          <w:iCs w:val="0"/>
-          <w:color w:val="auto"/>
-          <w:sz w:val="22"/>
-          <w:szCs w:val="22"/>
-        </w:rPr>
         <w:t xml:space="preserve"> and </w:t>
       </w:r>
       <w:proofErr w:type="spellStart"/>
       <w:r>
-        <w:rPr>
-          <w:i w:val="0"/>
-          <w:iCs w:val="0"/>
-          <w:color w:val="auto"/>
-          <w:sz w:val="22"/>
-          <w:szCs w:val="22"/>
-        </w:rPr>
         <w:t>Friedrichshain</w:t>
       </w:r>
       <w:proofErr w:type="spellEnd"/>
       <w:r>
-        <w:rPr>
-          <w:i w:val="0"/>
-          <w:iCs w:val="0"/>
-          <w:color w:val="auto"/>
-          <w:sz w:val="22"/>
-          <w:szCs w:val="22"/>
-        </w:rPr>
         <w:t>-Kreuzberg span the former East–West division, so their listing counts are split accordingly. In general, boroughs located closer to the city center tend to have higher concentrations of listings.</w:t>
       </w:r>
     </w:p>
+    <w:p/>
     <w:p>
       <w:pPr>
         <w:pStyle w:val="Caption"/>
-        <w:keepNext/>
       </w:pPr>
       <w:r>
         <w:t xml:space="preserve">Figure </w:t>
@@ -792,8 +661,8 @@
           <w:noProof/>
         </w:rPr>
         <w:drawing>
-          <wp:inline distT="0" distB="0" distL="0" distR="0" wp14:anchorId="58F30485" wp14:editId="6C8BF9FE">
-            <wp:extent cx="5829652" cy="2095687"/>
+          <wp:inline distT="0" distB="0" distL="0" distR="0" wp14:anchorId="58F30485" wp14:editId="69B66146">
+            <wp:extent cx="5829300" cy="2095560"/>
             <wp:effectExtent l="0" t="0" r="0" b="0"/>
             <wp:docPr id="1344255285" name="Picture 1"/>
             <wp:cNvGraphicFramePr>
@@ -822,7 +691,7 @@
                   <pic:spPr bwMode="auto">
                     <a:xfrm>
                       <a:off x="0" y="0"/>
-                      <a:ext cx="5844152" cy="2100899"/>
+                      <a:ext cx="5876713" cy="2112604"/>
                     </a:xfrm>
                     <a:prstGeom prst="rect">
                       <a:avLst/>
@@ -846,35 +715,29 @@
     </w:p>
     <w:p>
       <w:pPr>
+        <w:pStyle w:val="Heading2"/>
+      </w:pPr>
+      <w:r>
+        <w:lastRenderedPageBreak/>
+        <w:t>Descriptive Analysi</w:t>
+      </w:r>
+      <w:r>
+        <w:t>s</w:t>
+      </w:r>
+    </w:p>
+    <w:p>
+      <w:pPr>
         <w:spacing w:before="100" w:beforeAutospacing="1" w:after="100" w:afterAutospacing="1"/>
       </w:pPr>
-    </w:p>
-    <w:p>
-      <w:pPr>
-        <w:pStyle w:val="Heading2"/>
-      </w:pPr>
-      <w:r>
-        <w:t>Descriptive Analysi</w:t>
-      </w:r>
-      <w:r>
-        <w:t>s</w:t>
-      </w:r>
-    </w:p>
-    <w:p>
-      <w:pPr>
-        <w:spacing w:before="100" w:beforeAutospacing="1" w:after="100" w:afterAutospacing="1"/>
-      </w:pPr>
       <w:r>
         <w:t>We select a subset of descriptive variables from the Inside Airbnb dataset to compare listings on either side of the former Berlin Wall. These variables help highlight structural and qualitative differences—or similarities—between Airbnb offerings in East and West Berlin.</w:t>
       </w:r>
       <w:r>
         <w:t xml:space="preserve"> Characteristics analyzed </w:t>
       </w:r>
-      <w:proofErr w:type="gramStart"/>
-      <w:r>
-        <w:t>are:</w:t>
-      </w:r>
-      <w:proofErr w:type="gramEnd"/>
+      <w:r>
+        <w:t>are</w:t>
+      </w:r>
       <w:r>
         <w:t xml:space="preserve"> room type, licensing, nightly prices, </w:t>
       </w:r>
@@ -935,116 +798,106 @@
         <w:t xml:space="preserve"> </w:t>
       </w:r>
       <w:r>
-        <w:t>illustrates the distribution of these room types across East and West Berlin. The composition is notably similar across both regions. The majority of listings in both East and West Berlin are for entire homes or apartments, followed by private rooms. Shared rooms and hotel rooms represent only a small fraction of the total listings. Overall, there are no meaningful differences in room type distribution between the two sides of the former Berlin Wall.</w:t>
-      </w:r>
-    </w:p>
-    <w:tbl>
-      <w:tblPr>
-        <w:tblStyle w:val="TableGrid"/>
-        <w:tblW w:w="8799" w:type="dxa"/>
+        <w:t xml:space="preserve">illustrates the distribution of these room types across East and West Berlin. The composition is notably similar across both regions. </w:t>
+      </w:r>
+      <w:proofErr w:type="gramStart"/>
+      <w:r>
+        <w:t>The majority of</w:t>
+      </w:r>
+      <w:proofErr w:type="gramEnd"/>
+      <w:r>
+        <w:t xml:space="preserve"> listings in both East and West Berlin are for entire homes or apartments, followed by private rooms. Shared rooms and hotel rooms represent only a small fraction of the total listings. Overall, there are no meaningful differences in room type distribution between the two sides of the former Berlin Wall.</w:t>
+      </w:r>
+    </w:p>
+    <w:p>
+      <w:pPr>
+        <w:pStyle w:val="Caption"/>
+      </w:pPr>
+      <w:r>
+        <w:t xml:space="preserve">Figure </w:t>
+      </w:r>
+      <w:r>
+        <w:fldChar w:fldCharType="begin"/>
+      </w:r>
+      <w:r>
+        <w:instrText xml:space="preserve"> SEQ Figure \* ARABIC </w:instrText>
+      </w:r>
+      <w:r>
+        <w:fldChar w:fldCharType="separate"/>
+      </w:r>
+      <w:r>
+        <w:rPr>
+          <w:noProof/>
+        </w:rPr>
+        <w:t>3</w:t>
+      </w:r>
+      <w:r>
+        <w:rPr>
+          <w:noProof/>
+        </w:rPr>
+        <w:fldChar w:fldCharType="end"/>
+      </w:r>
+      <w:r>
+        <w:t>: Proportion of Room Types in East and West Berlin</w:t>
+      </w:r>
+    </w:p>
+    <w:p>
+      <w:pPr>
+        <w:spacing w:before="100" w:beforeAutospacing="1" w:after="100" w:afterAutospacing="1"/>
         <w:jc w:val="center"/>
-        <w:tblBorders>
-          <w:top w:val="none" w:sz="0" w:space="0" w:color="auto"/>
-          <w:left w:val="none" w:sz="0" w:space="0" w:color="auto"/>
-          <w:bottom w:val="none" w:sz="0" w:space="0" w:color="auto"/>
-          <w:right w:val="none" w:sz="0" w:space="0" w:color="auto"/>
-          <w:insideH w:val="none" w:sz="0" w:space="0" w:color="auto"/>
-          <w:insideV w:val="none" w:sz="0" w:space="0" w:color="auto"/>
-        </w:tblBorders>
-        <w:tblLook w:val="04A0" w:firstRow="1" w:lastRow="0" w:firstColumn="1" w:lastColumn="0" w:noHBand="0" w:noVBand="1"/>
-      </w:tblPr>
-      <w:tblGrid>
-        <w:gridCol w:w="8982"/>
-      </w:tblGrid>
-      <w:tr>
-        <w:trPr>
-          <w:trHeight w:val="3428"/>
-          <w:jc w:val="center"/>
-        </w:trPr>
-        <w:tc>
-          <w:tcPr>
-            <w:tcW w:w="8799" w:type="dxa"/>
-            <w:vAlign w:val="center"/>
-          </w:tcPr>
-          <w:p>
-            <w:pPr>
-              <w:pStyle w:val="Caption"/>
-              <w:keepNext/>
-            </w:pPr>
-            <w:r>
-              <w:t xml:space="preserve">Figure </w:t>
-            </w:r>
-            <w:fldSimple w:instr=" SEQ Figure \* ARABIC ">
-              <w:r>
-                <w:rPr>
-                  <w:noProof/>
-                </w:rPr>
-                <w:t>3</w:t>
-              </w:r>
-            </w:fldSimple>
-            <w:r>
-              <w:t>: Proportion of Room Types in East and West Berlin</w:t>
-            </w:r>
-            <w:r>
-              <w:rPr>
-                <w:noProof/>
-              </w:rPr>
-              <w:drawing>
-                <wp:inline distT="0" distB="0" distL="0" distR="0" wp14:anchorId="794CA731" wp14:editId="0DAFC5A2">
-                  <wp:extent cx="5566867" cy="2465222"/>
-                  <wp:effectExtent l="0" t="0" r="0" b="0"/>
-                  <wp:docPr id="191" name="Google Shape;191;p15" descr="A blue and orange pie chart&#10;&#10;AI-generated content may be incorrect."/>
-                  <wp:cNvGraphicFramePr>
-                    <a:graphicFrameLocks xmlns:a="http://schemas.openxmlformats.org/drawingml/2006/main" noGrp="1"/>
-                  </wp:cNvGraphicFramePr>
-                  <a:graphic xmlns:a="http://schemas.openxmlformats.org/drawingml/2006/main">
-                    <a:graphicData uri="http://schemas.openxmlformats.org/drawingml/2006/picture">
-                      <pic:pic xmlns:pic="http://schemas.openxmlformats.org/drawingml/2006/picture">
-                        <pic:nvPicPr>
-                          <pic:cNvPr id="191" name="Google Shape;191;p15" descr="A blue and orange pie chart&#10;&#10;AI-generated content may be incorrect."/>
-                          <pic:cNvPicPr preferRelativeResize="0">
-                            <a:picLocks noGrp="1"/>
-                          </pic:cNvPicPr>
-                        </pic:nvPicPr>
-                        <pic:blipFill rotWithShape="1">
-                          <a:blip r:embed="rId10">
-                            <a:alphaModFix/>
-                          </a:blip>
-                          <a:srcRect l="9453" t="6338" r="8292" b="-1"/>
-                          <a:stretch/>
-                        </pic:blipFill>
-                        <pic:spPr bwMode="auto">
-                          <a:xfrm>
-                            <a:off x="0" y="0"/>
-                            <a:ext cx="5825764" cy="2579872"/>
-                          </a:xfrm>
-                          <a:prstGeom prst="rect">
-                            <a:avLst/>
-                          </a:prstGeom>
-                          <a:noFill/>
-                          <a:ln>
-                            <a:noFill/>
-                          </a:ln>
-                          <a:extLst>
-                            <a:ext uri="{53640926-AAD7-44D8-BBD7-CCE9431645EC}">
-                              <a14:shadowObscured xmlns:a14="http://schemas.microsoft.com/office/drawing/2010/main"/>
-                            </a:ext>
-                          </a:extLst>
-                        </pic:spPr>
-                      </pic:pic>
-                    </a:graphicData>
-                  </a:graphic>
-                </wp:inline>
-              </w:drawing>
-            </w:r>
-          </w:p>
-        </w:tc>
-      </w:tr>
-    </w:tbl>
-    <w:p>
-      <w:pPr>
-        <w:spacing w:before="100" w:beforeAutospacing="1" w:after="100" w:afterAutospacing="1"/>
-      </w:pPr>
+      </w:pPr>
+      <w:r>
+        <w:rPr>
+          <w:noProof/>
+        </w:rPr>
+        <w:drawing>
+          <wp:inline distT="0" distB="0" distL="0" distR="0" wp14:anchorId="5236AEB5" wp14:editId="7FBF1305">
+            <wp:extent cx="5912870" cy="2786743"/>
+            <wp:effectExtent l="0" t="0" r="0" b="0"/>
+            <wp:docPr id="191" name="Google Shape;191;p15" descr="A blue and orange pie chart&#10;&#10;AI-generated content may be incorrect."/>
+            <wp:cNvGraphicFramePr>
+              <a:graphicFrameLocks xmlns:a="http://schemas.openxmlformats.org/drawingml/2006/main" noGrp="1"/>
+            </wp:cNvGraphicFramePr>
+            <a:graphic xmlns:a="http://schemas.openxmlformats.org/drawingml/2006/main">
+              <a:graphicData uri="http://schemas.openxmlformats.org/drawingml/2006/picture">
+                <pic:pic xmlns:pic="http://schemas.openxmlformats.org/drawingml/2006/picture">
+                  <pic:nvPicPr>
+                    <pic:cNvPr id="191" name="Google Shape;191;p15" descr="A blue and orange pie chart&#10;&#10;AI-generated content may be incorrect."/>
+                    <pic:cNvPicPr preferRelativeResize="0">
+                      <a:picLocks noGrp="1"/>
+                    </pic:cNvPicPr>
+                  </pic:nvPicPr>
+                  <pic:blipFill rotWithShape="1">
+                    <a:blip r:embed="rId10">
+                      <a:alphaModFix/>
+                    </a:blip>
+                    <a:srcRect l="9453" t="6338" r="8292" b="-1"/>
+                    <a:stretch/>
+                  </pic:blipFill>
+                  <pic:spPr bwMode="auto">
+                    <a:xfrm>
+                      <a:off x="0" y="0"/>
+                      <a:ext cx="6395437" cy="3014178"/>
+                    </a:xfrm>
+                    <a:prstGeom prst="rect">
+                      <a:avLst/>
+                    </a:prstGeom>
+                    <a:noFill/>
+                    <a:ln>
+                      <a:noFill/>
+                    </a:ln>
+                    <a:extLst>
+                      <a:ext uri="{53640926-AAD7-44D8-BBD7-CCE9431645EC}">
+                        <a14:shadowObscured xmlns:a14="http://schemas.microsoft.com/office/drawing/2010/main"/>
+                      </a:ext>
+                    </a:extLst>
+                  </pic:spPr>
+                </pic:pic>
+              </a:graphicData>
+            </a:graphic>
+          </wp:inline>
+        </w:drawing>
+      </w:r>
     </w:p>
     <w:p>
       <w:pPr>
@@ -1129,17 +982,16 @@
         <w:t>4</w:t>
       </w:r>
       <w:r>
-        <w:t xml:space="preserve"> presents a map of listing locations, with color intensity indicating price levels—darker shades represent higher nightly rates. Visually, there is no clear distinction in the spatial distribution of prices between East and West Berlin. Even when focusing specifically on listings within a </w:t>
+        <w:t xml:space="preserve"> presents a map of listing locations, with color intensity indicating price levels—darker shades represent higher nightly rates. Visually, there is no clear distinction in the spatial distribution of prices between East and West Berlin. Even when </w:t>
       </w:r>
       <w:r>
         <w:lastRenderedPageBreak/>
-        <w:t>2-kilometer radius of the central segment of the wall, no sharp contrasts in pricing emerge. Overall, Airbnb prices appear relatively similar on both sides of the wall.</w:t>
+        <w:t>focusing specifically on listings within a 2-kilometer radius of the central segment of the wall, no sharp contrasts in pricing emerge. Overall, Airbnb prices appear relatively similar on both sides of the wall.</w:t>
       </w:r>
     </w:p>
     <w:p>
       <w:pPr>
         <w:pStyle w:val="Caption"/>
-        <w:keepNext/>
       </w:pPr>
       <w:r>
         <w:t xml:space="preserve">Figure </w:t>
@@ -1159,12 +1011,13 @@
         <w:t xml:space="preserve">; </w:t>
       </w:r>
       <w:r>
-        <w:t>Price of Airbnb Within 20km of division (right)</w:t>
+        <w:t>Price of Airbnb Within 2km of division (right)</w:t>
       </w:r>
     </w:p>
     <w:p>
       <w:pPr>
         <w:spacing w:before="100" w:beforeAutospacing="1" w:after="100" w:afterAutospacing="1"/>
+        <w:jc w:val="center"/>
       </w:pPr>
       <w:r>
         <w:rPr>
@@ -1226,150 +1079,62 @@
         <w:t xml:space="preserve"> </w:t>
       </w:r>
       <w:r>
-        <w:rPr>
-          <w:rFonts w:eastAsia="Times New Roman" w:cs="Times New Roman"/>
-          <w:kern w:val="0"/>
-          <w:sz w:val="24"/>
-          <w:szCs w:val="24"/>
-          <w14:ligatures w14:val="none"/>
-        </w:rPr>
         <w:t xml:space="preserve">Airbnb guests can leave star ratings for each listing, ranging from zero to five. We investigate whether these review scores differ across the two sides of the former Berlin Wall. The star rating used in our analysis reflects the average score each listing has received over its lifetime. </w:t>
       </w:r>
       <w:r>
         <w:rPr>
-          <w:rFonts w:eastAsia="Times New Roman" w:cs="Times New Roman"/>
           <w:b/>
           <w:bCs/>
-          <w:kern w:val="0"/>
-          <w:sz w:val="24"/>
-          <w:szCs w:val="24"/>
-          <w14:ligatures w14:val="none"/>
         </w:rPr>
         <w:t xml:space="preserve">Figure </w:t>
       </w:r>
       <w:r>
         <w:rPr>
-          <w:rFonts w:eastAsia="Times New Roman" w:cs="Times New Roman"/>
           <w:b/>
           <w:bCs/>
-          <w:kern w:val="0"/>
-          <w:sz w:val="24"/>
-          <w:szCs w:val="24"/>
-          <w14:ligatures w14:val="none"/>
         </w:rPr>
         <w:t>5</w:t>
       </w:r>
       <w:r>
-        <w:rPr>
-          <w:rFonts w:eastAsia="Times New Roman" w:cs="Times New Roman"/>
-          <w:kern w:val="0"/>
-          <w:sz w:val="24"/>
-          <w:szCs w:val="24"/>
-          <w14:ligatures w14:val="none"/>
-        </w:rPr>
         <w:t xml:space="preserve"> displays a map of Berlin with color intensity representing the average review score—darker shades indicate higher ratings.</w:t>
       </w:r>
     </w:p>
     <w:p>
-      <w:pPr>
-        <w:spacing w:before="100" w:beforeAutospacing="1" w:after="100" w:afterAutospacing="1" w:line="240" w:lineRule="auto"/>
-        <w:ind w:firstLine="720"/>
-        <w:rPr>
-          <w:rFonts w:eastAsia="Times New Roman" w:cs="Times New Roman"/>
-          <w:kern w:val="0"/>
-          <w:sz w:val="24"/>
-          <w:szCs w:val="24"/>
-          <w14:ligatures w14:val="none"/>
-        </w:rPr>
-      </w:pPr>
-      <w:r>
-        <w:rPr>
-          <w:rFonts w:eastAsia="Times New Roman" w:cs="Times New Roman"/>
-          <w:kern w:val="0"/>
-          <w:sz w:val="24"/>
-          <w:szCs w:val="24"/>
-          <w14:ligatures w14:val="none"/>
-        </w:rPr>
+      <w:r>
         <w:t>In the dataset, very few listings received less than 4</w:t>
       </w:r>
       <w:r>
-        <w:rPr>
-          <w:rFonts w:eastAsia="Times New Roman" w:cs="Times New Roman"/>
-          <w:kern w:val="0"/>
-          <w:sz w:val="24"/>
-          <w:szCs w:val="24"/>
-          <w14:ligatures w14:val="none"/>
-        </w:rPr>
         <w:t>.0</w:t>
       </w:r>
       <w:r>
-        <w:rPr>
-          <w:rFonts w:eastAsia="Times New Roman" w:cs="Times New Roman"/>
-          <w:kern w:val="0"/>
-          <w:sz w:val="24"/>
-          <w:szCs w:val="24"/>
-          <w14:ligatures w14:val="none"/>
-        </w:rPr>
         <w:t xml:space="preserve"> stars. As a result, all listings with lower ratings are grouped into a single-color category to emphasize varying scores. This distribution raises concerns about potential data selection bias: if Inside Airbnb disproportionately captures listings with higher ratings, lower-rated listings may be underrepresented or excluded altogether. Such a pattern could obscure any meaningful differences in review distributions across East and West Berlin.</w:t>
       </w:r>
     </w:p>
     <w:p>
-      <w:pPr>
-        <w:spacing w:before="100" w:beforeAutospacing="1" w:after="100" w:afterAutospacing="1" w:line="240" w:lineRule="auto"/>
-        <w:ind w:firstLine="720"/>
-        <w:rPr>
-          <w:rFonts w:eastAsia="Times New Roman" w:cs="Times New Roman"/>
-          <w:kern w:val="0"/>
-          <w:sz w:val="24"/>
-          <w:szCs w:val="24"/>
-          <w14:ligatures w14:val="none"/>
-        </w:rPr>
-      </w:pPr>
-      <w:r>
-        <w:rPr>
-          <w:rFonts w:eastAsia="Times New Roman" w:cs="Times New Roman"/>
-          <w:kern w:val="0"/>
-          <w:sz w:val="24"/>
-          <w:szCs w:val="24"/>
-          <w14:ligatures w14:val="none"/>
-        </w:rPr>
+      <w:r>
         <w:t xml:space="preserve">Given </w:t>
       </w:r>
       <w:r>
-        <w:rPr>
-          <w:rFonts w:eastAsia="Times New Roman" w:cs="Times New Roman"/>
-          <w:kern w:val="0"/>
-          <w:sz w:val="24"/>
-          <w:szCs w:val="24"/>
-          <w14:ligatures w14:val="none"/>
-        </w:rPr>
         <w:t xml:space="preserve">this limitation, we find no stark differences in review scores between </w:t>
       </w:r>
       <w:r>
-        <w:rPr>
-          <w:rFonts w:eastAsia="Times New Roman" w:cs="Times New Roman"/>
-          <w:kern w:val="0"/>
-          <w:sz w:val="24"/>
-          <w:szCs w:val="24"/>
-          <w14:ligatures w14:val="none"/>
-        </w:rPr>
         <w:t>East and West Berlin</w:t>
       </w:r>
       <w:r>
-        <w:rPr>
-          <w:rFonts w:eastAsia="Times New Roman" w:cs="Times New Roman"/>
-          <w:kern w:val="0"/>
-          <w:sz w:val="24"/>
-          <w:szCs w:val="24"/>
-          <w14:ligatures w14:val="none"/>
-        </w:rPr>
-        <w:t>. Ratings appear fairly evenly distributed across the city, with no clear clustering of particularly high or low-rated listings. This pattern remains consistent even when focusing only on listings within 2 kilometers of the wall.</w:t>
+        <w:t xml:space="preserve">. Ratings appear </w:t>
+      </w:r>
+      <w:proofErr w:type="gramStart"/>
+      <w:r>
+        <w:t>fairly evenly</w:t>
+      </w:r>
+      <w:proofErr w:type="gramEnd"/>
+      <w:r>
+        <w:t xml:space="preserve"> distributed across the city, with no clear clustering of particularly high or low-rated listings. This pattern remains consistent even when focusing only on listings within 2 kilometers of the wall.</w:t>
       </w:r>
     </w:p>
     <w:p>
       <w:pPr>
         <w:pStyle w:val="Caption"/>
-        <w:keepNext/>
       </w:pPr>
       <w:r>
         <w:lastRenderedPageBreak/>
@@ -1387,35 +1152,12 @@
         <w:t>:</w:t>
       </w:r>
       <w:r>
-        <w:t xml:space="preserve"> Star Review of </w:t>
-      </w:r>
-      <w:proofErr w:type="spellStart"/>
-      <w:r>
-        <w:t>Airbnbs</w:t>
-      </w:r>
-      <w:proofErr w:type="spellEnd"/>
-      <w:r>
-        <w:t xml:space="preserve"> in Berlin</w:t>
-      </w:r>
-      <w:r>
-        <w:t xml:space="preserve"> (left); Star Review of </w:t>
-      </w:r>
-      <w:proofErr w:type="spellStart"/>
-      <w:r>
-        <w:t>Airbnb</w:t>
-      </w:r>
-      <w:r>
-        <w:t>s</w:t>
-      </w:r>
-      <w:proofErr w:type="spellEnd"/>
-      <w:r>
-        <w:t xml:space="preserve"> Within 20km of division (right)</w:t>
+        <w:t xml:space="preserve"> Star Review of Airbnb in Berlin (left); Star Review of Airbnb Within 2km of division (right)</w:t>
       </w:r>
     </w:p>
     <w:p>
       <w:pPr>
         <w:pStyle w:val="Caption"/>
-        <w:keepNext/>
       </w:pPr>
       <w:r>
         <w:rPr>
@@ -1481,6 +1223,7 @@
         <w:t>Sentiment Analysis</w:t>
       </w:r>
     </w:p>
+    <w:p/>
     <w:p>
       <w:r>
         <w:t>Given the limited descriptive differences identified between East and West Berlin Airbnb listings, we proceed with a more nuanced examination using text and sentiment analyses. Specifically, leveraging the Inside Airbnb dataset, we conduct a descriptive analysis of three textual components: guest reviews, listed amenities, and host descriptions. Additionally, these analyses are performed with consideration of neighborhood-level variation</w:t>
@@ -1502,14 +1245,9 @@
       <w:r>
         <w:t xml:space="preserve">, such </w:t>
       </w:r>
-      <w:proofErr w:type="gramStart"/>
-      <w:r>
-        <w:t xml:space="preserve">as </w:t>
-      </w:r>
-      <w:r>
-        <w:t xml:space="preserve"> “</w:t>
-      </w:r>
-      <w:proofErr w:type="gramEnd"/>
+      <w:r>
+        <w:t>as “</w:t>
+      </w:r>
       <w:r>
         <w:t>the” or “if”.</w:t>
       </w:r>
@@ -1589,7 +1327,11 @@
       </w:r>
       <w:proofErr w:type="spellEnd"/>
       <w:r>
-        <w:t>), as well as contextually uninformative terms such as “host” and “</w:t>
+        <w:t xml:space="preserve">), as well as contextually uninformative terms such as “host” and </w:t>
+      </w:r>
+      <w:r>
+        <w:lastRenderedPageBreak/>
+        <w:t>“</w:t>
       </w:r>
       <w:r>
         <w:t>b</w:t>
@@ -1598,73 +1340,75 @@
         <w:t>erlin.” This leaves the five most common words: great, nice, super, clean, and good</w:t>
       </w:r>
       <w:r>
+        <w:t xml:space="preserve">. When disaggregating the data by East and West Berlin, we </w:t>
+      </w:r>
+      <w:r>
+        <w:t xml:space="preserve">find </w:t>
+      </w:r>
+      <w:r>
+        <w:t>no meaningful difference in word frequencies between the two sides, as seen in Figure 6.</w:t>
+      </w:r>
+      <w:r>
+        <w:t xml:space="preserve"> </w:t>
+      </w:r>
+      <w:r>
+        <w:t xml:space="preserve">The only notable difference in the top 10 lists is the appearance of </w:t>
+      </w:r>
+      <w:r>
+        <w:t>“</w:t>
+      </w:r>
+      <w:r>
+        <w:t>restaurants</w:t>
+      </w:r>
+      <w:r>
+        <w:t>”</w:t>
+      </w:r>
+      <w:r>
+        <w:t xml:space="preserve"> in East Berlin and </w:t>
+      </w:r>
+      <w:r>
+        <w:t>“</w:t>
+      </w:r>
+      <w:r>
+        <w:t>comfortable</w:t>
+      </w:r>
+      <w:r>
+        <w:t>”</w:t>
+      </w:r>
+      <w:r>
+        <w:t xml:space="preserve"> in West Berlin. </w:t>
+      </w:r>
+      <w:r>
+        <w:t>All identified words carry positive connotations</w:t>
+      </w:r>
+      <w:r>
         <w:t xml:space="preserve">. </w:t>
       </w:r>
       <w:r>
-        <w:t>When disaggregating the data by East and West Berlin, we no meaningful difference in word frequencies between the two sides, as seen in Figure 6.</w:t>
+        <w:t xml:space="preserve">These results are consistent with our earlier observation that </w:t>
+      </w:r>
+      <w:proofErr w:type="gramStart"/>
+      <w:r>
+        <w:t>the vast majority of</w:t>
+      </w:r>
+      <w:proofErr w:type="gramEnd"/>
+      <w:r>
+        <w:t xml:space="preserve"> star ratings are above 4.0, suggesting</w:t>
+      </w:r>
+      <w:r>
+        <w:t xml:space="preserve"> either</w:t>
+      </w:r>
+      <w:r>
+        <w:t xml:space="preserve"> uniformly positive guest experiences</w:t>
+      </w:r>
+      <w:r>
+        <w:t>, or biased data</w:t>
+      </w:r>
+      <w:r>
+        <w:t xml:space="preserve">. </w:t>
       </w:r>
       <w:r>
         <w:t xml:space="preserve"> </w:t>
-      </w:r>
-      <w:r>
-        <w:t xml:space="preserve">The only notable difference in the top 10 lists is the appearance of </w:t>
-      </w:r>
-      <w:r>
-        <w:t>“</w:t>
-      </w:r>
-      <w:r>
-        <w:t>restaurants</w:t>
-      </w:r>
-      <w:r>
-        <w:t>”</w:t>
-      </w:r>
-      <w:r>
-        <w:t xml:space="preserve"> in East Berlin and </w:t>
-      </w:r>
-      <w:r>
-        <w:t>“</w:t>
-      </w:r>
-      <w:r>
-        <w:t>comfortable</w:t>
-      </w:r>
-      <w:r>
-        <w:t>”</w:t>
-      </w:r>
-      <w:r>
-        <w:t xml:space="preserve"> in West </w:t>
-      </w:r>
-      <w:r>
-        <w:lastRenderedPageBreak/>
-        <w:t>Berlin</w:t>
-      </w:r>
-      <w:r>
-        <w:t xml:space="preserve">. </w:t>
-      </w:r>
-      <w:r>
-        <w:t xml:space="preserve">All positively connoted words. </w:t>
-      </w:r>
-      <w:r>
-        <w:t xml:space="preserve">These results are consistent with our earlier observation that </w:t>
-      </w:r>
-      <w:proofErr w:type="gramStart"/>
-      <w:r>
-        <w:t>the vast majority of</w:t>
-      </w:r>
-      <w:proofErr w:type="gramEnd"/>
-      <w:r>
-        <w:t xml:space="preserve"> star ratings are above 4.0, suggesting</w:t>
-      </w:r>
-      <w:r>
-        <w:t xml:space="preserve"> either</w:t>
-      </w:r>
-      <w:r>
-        <w:t xml:space="preserve"> uniformly positive guest experiences</w:t>
-      </w:r>
-      <w:r>
-        <w:t>, or biased data</w:t>
-      </w:r>
-      <w:r>
-        <w:t xml:space="preserve">. </w:t>
       </w:r>
     </w:p>
     <w:p>
@@ -1678,7 +1422,6 @@
     <w:p>
       <w:pPr>
         <w:pStyle w:val="Caption"/>
-        <w:keepNext/>
       </w:pPr>
       <w:r>
         <w:t xml:space="preserve">Figure </w:t>
@@ -1692,7 +1435,13 @@
         </w:r>
       </w:fldSimple>
       <w:r>
-        <w:t>: Word Cloud for Top Words in Guest Reviews</w:t>
+        <w:t xml:space="preserve">: Word Cloud for Top </w:t>
+      </w:r>
+      <w:r>
+        <w:t>Words</w:t>
+      </w:r>
+      <w:r>
+        <w:t xml:space="preserve"> in Guest Reviews</w:t>
       </w:r>
     </w:p>
     <w:p>
@@ -1701,7 +1450,6 @@
         <w:rPr>
           <w:rFonts w:eastAsia="Times New Roman" w:cs="Times New Roman"/>
           <w:kern w:val="0"/>
-          <w:sz w:val="24"/>
           <w:szCs w:val="24"/>
           <w14:ligatures w14:val="none"/>
         </w:rPr>
@@ -1711,8 +1459,8 @@
           <w:noProof/>
         </w:rPr>
         <w:drawing>
-          <wp:inline distT="0" distB="0" distL="0" distR="0" wp14:anchorId="16D7BD1F" wp14:editId="2EB25CEF">
-            <wp:extent cx="5943600" cy="1609090"/>
+          <wp:inline distT="0" distB="0" distL="0" distR="0" wp14:anchorId="16D7BD1F" wp14:editId="05679330">
+            <wp:extent cx="5943600" cy="1861457"/>
             <wp:effectExtent l="0" t="0" r="0" b="0"/>
             <wp:docPr id="2038045734" name="Picture 1" descr="A close up of words&#10;&#10;Description automatically generated"/>
             <wp:cNvGraphicFramePr>
@@ -1743,7 +1491,7 @@
                   <pic:spPr bwMode="auto">
                     <a:xfrm>
                       <a:off x="0" y="0"/>
-                      <a:ext cx="5943600" cy="1609090"/>
+                      <a:ext cx="5984192" cy="1874170"/>
                     </a:xfrm>
                     <a:prstGeom prst="rect">
                       <a:avLst/>
@@ -1875,28 +1623,13 @@
         <w:ind w:firstLine="720"/>
       </w:pPr>
       <w:r>
-        <w:t xml:space="preserve">We also examine whether Airbnb sentiment differs by price. For both positive and negative reviews, the median nightly price of listings in East Berlin was $10 higher than in West Berlin. Within each </w:t>
-      </w:r>
-      <w:r>
-        <w:t>side,</w:t>
-      </w:r>
-      <w:r>
-        <w:t xml:space="preserve"> the median price difference between listings with positive and negative sentiment was $5. These findings suggest that neither price nor </w:t>
-      </w:r>
-      <w:r>
-        <w:t xml:space="preserve">division-side </w:t>
+        <w:t xml:space="preserve">We also examine whether Airbnb sentiment differs by price. For both positive and negative reviews, the median nightly price of listings in East Berlin was $10 higher than in West Berlin. Within each side, the median price difference between listings with positive and negative sentiment was $5. These findings suggest that neither price nor division-side </w:t>
       </w:r>
       <w:r>
         <w:t>likely</w:t>
       </w:r>
       <w:r>
-        <w:t xml:space="preserve"> influences the emotional tone of guest reviews. Overall, we find no meaningful difference in sentiment scores between East and West Berlin, indicating that the city’s historical division </w:t>
-      </w:r>
-      <w:r>
-        <w:t>may</w:t>
-      </w:r>
-      <w:r>
-        <w:t xml:space="preserve"> not play a discernible role in shaping guests’ experiences or perceptions.</w:t>
+        <w:t xml:space="preserve"> influences the emotional tone of guest reviews. Overall, we find no meaningful difference in sentiment scores between East and West Berlin, indicating that the city’s historical division may not play a discernible role in shaping guests’ experiences or perceptions.</w:t>
       </w:r>
     </w:p>
     <w:p>
@@ -1904,10 +1637,11 @@
         <w:ind w:firstLine="720"/>
       </w:pPr>
       <w:r>
-        <w:t>Although, one interesting takeaway is that the five most negative reviews—on both sides of the former divide—were written in German, while the five most positive were written in English. While not directly related to East-West distinctions, this observation may reflect underlying cultural differences in expression or expectation. This presents an avenue for future inquiry, particularly if review language can be linked to Airbnb guest country of origin. Such a linkage would allow for comparative sentiment analysis between German and non-German tourists.</w:t>
-      </w:r>
-      <w:r>
-        <w:t xml:space="preserve"> </w:t>
+        <w:t xml:space="preserve">Although, one interesting takeaway is that the five most negative reviews—on both sides of the former divide—were written in German, while the five most positive were written in English. While not directly related to East-West distinctions, this observation may reflect underlying cultural differences in expression or expectation. This presents an avenue for future inquiry, particularly if review language can be linked to Airbnb guest country of origin. Such a </w:t>
+      </w:r>
+      <w:r>
+        <w:lastRenderedPageBreak/>
+        <w:t xml:space="preserve">linkage would allow for comparative sentiment analysis between German and non-German tourists. </w:t>
       </w:r>
       <w:r>
         <w:t xml:space="preserve">Future research might expand on this analysis by examining sentiment differences across boroughs, by Airbnb size, listing tenure, or </w:t>
@@ -1915,11 +1649,17 @@
       <w:r>
         <w:t xml:space="preserve">characteristics, however, this is out of the scope of our study at this time. </w:t>
       </w:r>
+    </w:p>
+    <w:p>
+      <w:pPr>
+        <w:ind w:firstLine="720"/>
+      </w:pPr>
     </w:p>
     <w:tbl>
       <w:tblPr>
         <w:tblStyle w:val="TableGrid"/>
         <w:tblW w:w="0" w:type="auto"/>
+        <w:jc w:val="center"/>
         <w:tblBorders>
           <w:top w:val="none" w:sz="0" w:space="0" w:color="auto"/>
           <w:left w:val="none" w:sz="0" w:space="0" w:color="auto"/>
@@ -1935,38 +1675,49 @@
         <w:gridCol w:w="1096"/>
       </w:tblGrid>
       <w:tr>
+        <w:trPr>
+          <w:jc w:val="center"/>
+        </w:trPr>
         <w:tc>
           <w:tcPr>
             <w:tcW w:w="8264" w:type="dxa"/>
+            <w:vAlign w:val="center"/>
           </w:tcPr>
           <w:p>
             <w:pPr>
               <w:pStyle w:val="Caption"/>
-              <w:keepNext/>
             </w:pPr>
             <w:r>
-              <w:lastRenderedPageBreak/>
               <w:t xml:space="preserve">Figure </w:t>
             </w:r>
-            <w:fldSimple w:instr=" SEQ Figure \* ARABIC ">
-              <w:r>
-                <w:rPr>
-                  <w:noProof/>
-                </w:rPr>
-                <w:t>7</w:t>
-              </w:r>
-            </w:fldSimple>
             <w:r>
-              <w:t xml:space="preserve">: Airbnb Listings Colored by Sentiment Scores based on </w:t>
+              <w:fldChar w:fldCharType="begin"/>
             </w:r>
-            <w:proofErr w:type="gramStart"/>
             <w:r>
-              <w:t>Reviews</w:t>
+              <w:instrText xml:space="preserve"> SEQ Figure \* ARABIC </w:instrText>
             </w:r>
-            <w:proofErr w:type="gramEnd"/>
+            <w:r>
+              <w:fldChar w:fldCharType="separate"/>
+            </w:r>
+            <w:r>
+              <w:rPr>
+                <w:noProof/>
+              </w:rPr>
+              <w:t>7</w:t>
+            </w:r>
+            <w:r>
+              <w:rPr>
+                <w:noProof/>
+              </w:rPr>
+              <w:fldChar w:fldCharType="end"/>
+            </w:r>
+            <w:r>
+              <w:t>: Airbnb Listings Colored by Sentiment Scores based on Reviews</w:t>
+            </w:r>
           </w:p>
           <w:p>
             <w:pPr>
+              <w:jc w:val="center"/>
               <w:rPr>
                 <w:noProof/>
               </w:rPr>
@@ -1980,8 +1731,8 @@
                 <w:szCs w:val="24"/>
               </w:rPr>
               <w:drawing>
-                <wp:inline distT="0" distB="0" distL="0" distR="0" wp14:anchorId="33D6F5E0" wp14:editId="28DE808F">
-                  <wp:extent cx="3816439" cy="3013398"/>
+                <wp:inline distT="0" distB="0" distL="0" distR="0" wp14:anchorId="33D6F5E0" wp14:editId="00B593BC">
+                  <wp:extent cx="4053276" cy="3200400"/>
                   <wp:effectExtent l="0" t="0" r="0" b="0"/>
                   <wp:docPr id="1482044401" name="Picture 2"/>
                   <wp:cNvGraphicFramePr>
@@ -2010,7 +1761,7 @@
                         <pic:spPr bwMode="auto">
                           <a:xfrm>
                             <a:off x="0" y="0"/>
-                            <a:ext cx="3842233" cy="3033764"/>
+                            <a:ext cx="4098694" cy="3236261"/>
                           </a:xfrm>
                           <a:prstGeom prst="rect">
                             <a:avLst/>
@@ -2031,6 +1782,17 @@
                 </wp:inline>
               </w:drawing>
             </w:r>
+          </w:p>
+        </w:tc>
+        <w:tc>
+          <w:tcPr>
+            <w:tcW w:w="1096" w:type="dxa"/>
+            <w:vAlign w:val="bottom"/>
+          </w:tcPr>
+          <w:p>
+            <w:pPr>
+              <w:jc w:val="center"/>
+            </w:pPr>
             <w:r>
               <w:rPr>
                 <w:rFonts w:eastAsia="Times New Roman" w:cs="Times New Roman"/>
@@ -2040,7 +1802,7 @@
                 <w:szCs w:val="24"/>
               </w:rPr>
               <w:drawing>
-                <wp:inline distT="0" distB="0" distL="0" distR="0" wp14:anchorId="2634FA8B" wp14:editId="7AF6AD56">
+                <wp:inline distT="0" distB="0" distL="0" distR="0" wp14:anchorId="40650303" wp14:editId="7E315A42">
                   <wp:extent cx="515471" cy="3014344"/>
                   <wp:effectExtent l="0" t="0" r="0" b="0"/>
                   <wp:docPr id="561425485" name="Picture 2" descr="A screenshot of a map&#10;&#10;Description automatically generated"/>
@@ -2093,711 +1855,330 @@
             </w:r>
           </w:p>
         </w:tc>
-        <w:tc>
-          <w:tcPr>
-            <w:tcW w:w="1096" w:type="dxa"/>
-          </w:tcPr>
-          <w:p/>
-        </w:tc>
       </w:tr>
     </w:tbl>
     <w:p/>
     <w:p>
-      <w:pPr>
-        <w:spacing w:before="100" w:beforeAutospacing="1" w:after="100" w:afterAutospacing="1"/>
+      <w:r>
+        <w:rPr>
+          <w:b/>
+          <w:bCs/>
+        </w:rPr>
+        <w:t>Amenity Descriptions:</w:t>
+      </w:r>
+      <w:r>
+        <w:t xml:space="preserve"> </w:t>
+      </w:r>
+      <w:r>
+        <w:t>Amenities offered in Airbnb listings can influence guest decisions and may potentially reflect lingering spatial patterns rooted in the historical East–West division of Berlin. If this division shape</w:t>
+      </w:r>
+      <w:r>
+        <w:t>d</w:t>
+      </w:r>
+      <w:r>
+        <w:t xml:space="preserve"> the housing market—through infrastructure, policy, or other channels—it could be reflected in the types or quantities of amenities provided. </w:t>
+      </w:r>
+      <w:r>
+        <w:t xml:space="preserve">Further, </w:t>
+      </w:r>
+      <w:r>
+        <w:t>Given the differences in long-term housing prices between East and West Berlin—but no such differences in Airbnb nightly rates—one might expect East Berlin listings to offer more amenities for the same price compared to those in West Berlin.</w:t>
+      </w:r>
+      <w:r>
+        <w:t xml:space="preserve"> </w:t>
+      </w:r>
+      <w:r>
+        <w:t xml:space="preserve">However, our analysis finds no significant difference in the ten most frequently listed amenities across the former divide. These include Wi-Fi, kitchen, heating, essentials, washer, dryer, hair dryer, alarm, smoke detector, and hot water. This similarity is unsurprising, given Berlin’s level of economic development and the fact that these amenities are </w:t>
+      </w:r>
+      <w:r>
+        <w:t>normal</w:t>
+      </w:r>
+      <w:r>
+        <w:t xml:space="preserve"> goods.</w:t>
+      </w:r>
+    </w:p>
+    <w:p>
+      <w:r>
+        <w:t>We also explored the use of sentiment analysis on amenity listings but found it to be an unsuitable method in this context. By design, amenities are intended to convey positive features, yet the sentiment tool can misclassify them due to isolated word associations. For instance, an Airbnb listing that includes “fire extinguisher,” “kitchen,” “smoke,” “alarm,” “TV,” “washer,” and “Wi-Fi”</w:t>
+      </w:r>
+      <w:r>
+        <w:t xml:space="preserve"> as their amenities</w:t>
+      </w:r>
+      <w:r>
+        <w:t xml:space="preserve"> received a sentiment score of –0.59. This likely results from </w:t>
+      </w:r>
+      <w:r>
+        <w:lastRenderedPageBreak/>
+        <w:t xml:space="preserve">negative </w:t>
+      </w:r>
+      <w:r>
+        <w:t xml:space="preserve">values </w:t>
+      </w:r>
+      <w:r>
+        <w:t xml:space="preserve">assigned to words like “fire,” “extinguisher,” “alarm,” and “smoke,” despite these features </w:t>
+      </w:r>
+      <w:r>
+        <w:t xml:space="preserve">potentially </w:t>
+      </w:r>
+      <w:r>
+        <w:t>signaling safety and quality to guests. Therefore, we conclude that sentiment analysis does not reliably capture the intended meaning or guest perception of amenity listings.</w:t>
+      </w:r>
+    </w:p>
+    <w:p>
+      <w:r>
+        <w:rPr>
+          <w:b/>
+          <w:bCs/>
+        </w:rPr>
+        <w:t xml:space="preserve">Host Descriptions: </w:t>
+      </w:r>
+      <w:r>
+        <w:t xml:space="preserve">If there remain meaningful sociodemographic differences between East and West Berlin—potentially as a legacy of the city's historical division—then such differences might manifest in the language used by hosts to describe their listings. This hypothesis assumes, however, that Airbnb hosts typically operate within a single geographic area and do not maintain listings on both sides of the former divide. Even under this assumption, our analysis reveals no meaningful differences in host description language between East and West Berlin. </w:t>
+      </w:r>
+    </w:p>
+    <w:p>
+      <w:r>
+        <w:t xml:space="preserve">As with </w:t>
+      </w:r>
+      <w:r>
+        <w:t>amenity descriptions</w:t>
+      </w:r>
+      <w:r>
+        <w:t xml:space="preserve">, we attempted a sentiment analysis of host descriptions to further investigate potential differences. </w:t>
+      </w:r>
+      <w:bookmarkStart w:id="0" w:name="_Hlk198218115"/>
+      <w:r>
+        <w:t>However, we found that sentiment analysis tools did not perform reliably on this category of text.</w:t>
+      </w:r>
+      <w:bookmarkEnd w:id="0"/>
+      <w:r>
+        <w:t xml:space="preserve"> For example, the phrase: “Forget your worries in this spacious and quiet space” </w:t>
+      </w:r>
+      <w:r>
+        <w:t>received</w:t>
+      </w:r>
+      <w:r>
+        <w:t xml:space="preserve"> a sentiment score of –0.57, erroneously implying a strongly negative sentiment. We attribute this misclassification to the sentiment analysis model's treatment of individual words such as “forget” and “worries”, which are weighted negatively in isolation. However, in context, the phrase clearly conveys a positive </w:t>
+      </w:r>
+      <w:r>
+        <w:t>message</w:t>
+      </w:r>
+      <w:r>
+        <w:t xml:space="preserve">. Due to </w:t>
+      </w:r>
+      <w:r>
+        <w:t>this misalignment</w:t>
+      </w:r>
+      <w:r>
+        <w:t xml:space="preserve">, we conclude that </w:t>
+      </w:r>
+      <w:r>
+        <w:t>a</w:t>
+      </w:r>
+      <w:r>
+        <w:t xml:space="preserve"> sentiment analysis tool</w:t>
+      </w:r>
+      <w:r>
+        <w:t xml:space="preserve"> is</w:t>
+      </w:r>
+      <w:r>
+        <w:t xml:space="preserve"> not well-suited for evaluating </w:t>
+      </w:r>
+      <w:r>
+        <w:t xml:space="preserve">Airbnb </w:t>
+      </w:r>
+      <w:r>
+        <w:t>host-generated marketing language. As a result, we do not present further sentiment-based findings from host descriptions.</w:t>
+      </w:r>
+    </w:p>
+    <w:p>
+      <w:proofErr w:type="gramStart"/>
+      <w:r>
+        <w:t>Similar</w:t>
+      </w:r>
+      <w:r>
+        <w:t xml:space="preserve"> to</w:t>
+      </w:r>
+      <w:proofErr w:type="gramEnd"/>
+      <w:r>
+        <w:t xml:space="preserve"> our descriptive analysis, the </w:t>
+      </w:r>
+      <w:r>
+        <w:t>preliminary</w:t>
+      </w:r>
+      <w:r>
+        <w:t xml:space="preserve"> </w:t>
+      </w:r>
+      <w:r>
+        <w:t xml:space="preserve">text and </w:t>
+      </w:r>
+      <w:r>
+        <w:t>sentiment analys</w:t>
+      </w:r>
+      <w:r>
+        <w:t>e</w:t>
+      </w:r>
+      <w:r>
+        <w:t>s find</w:t>
+      </w:r>
+      <w:r>
+        <w:t>s</w:t>
+      </w:r>
+      <w:r>
+        <w:t xml:space="preserve"> </w:t>
+      </w:r>
+      <w:r>
+        <w:t xml:space="preserve">no </w:t>
+      </w:r>
+      <w:r>
+        <w:t>meaningful difference in the Airbnb market of East and West Berlin</w:t>
+      </w:r>
+      <w:r>
+        <w:t>.</w:t>
+      </w:r>
+    </w:p>
+    <w:p>
+      <w:pPr>
+        <w:rPr>
+          <w:sz w:val="22"/>
+        </w:rPr>
+      </w:pPr>
+    </w:p>
+    <w:p>
+      <w:pPr>
+        <w:pStyle w:val="Heading2"/>
+      </w:pPr>
+      <w:r>
+        <w:t>Conclusion</w:t>
+      </w:r>
+    </w:p>
+    <w:p/>
+    <w:p>
+      <w:r>
+        <w:t>This study</w:t>
+      </w:r>
+      <w:r>
+        <w:t xml:space="preserve"> preliminarily</w:t>
+      </w:r>
+      <w:r>
+        <w:t xml:space="preserve"> examines the characteristics of Airbnb listings in East and West Berlin using data from the December 2024 release of Inside Airbnb. Despite the city’s historical division, our analysis reveals substantial similarities across both regions in terms of Airbnb attributes. Prices per night, average review ratings, room type distributions, and licensure rates show no significant differences between East and West Berlin. Even </w:t>
+      </w:r>
+      <w:r>
+        <w:t xml:space="preserve">by applying a </w:t>
+      </w:r>
+      <w:r>
+        <w:t>within 2-kilometer buffer of the former Berlin Wall, listing characteristics remain comparable</w:t>
+      </w:r>
+      <w:r>
+        <w:t xml:space="preserve"> within and outside of the 2-kilometer</w:t>
+      </w:r>
+      <w:r>
+        <w:t>. Sentiment analysis of guest reviews also shows no meaningful divergence in tone or content across the two sides.</w:t>
+      </w:r>
+    </w:p>
+    <w:p>
+      <w:r>
+        <w:t xml:space="preserve">Interestingly, this convergence occurs despite ongoing </w:t>
+      </w:r>
+      <w:r>
+        <w:t xml:space="preserve">household </w:t>
+      </w:r>
+      <w:r>
+        <w:t xml:space="preserve">differences in East and West </w:t>
+      </w:r>
+      <w:r>
+        <w:t xml:space="preserve">Germany </w:t>
+      </w:r>
+      <w:proofErr w:type="gramStart"/>
+      <w:r>
+        <w:t xml:space="preserve">still </w:t>
+      </w:r>
+      <w:r>
+        <w:t>persisting</w:t>
+      </w:r>
+      <w:proofErr w:type="gramEnd"/>
+      <w:r>
+        <w:t xml:space="preserve"> from the former Berlin Wall</w:t>
+      </w:r>
+      <w:r>
+        <w:t xml:space="preserve"> </w:t>
+      </w:r>
+      <w:r>
+        <w:t>(</w:t>
+      </w:r>
+      <w:proofErr w:type="spellStart"/>
+      <w:r>
+        <w:t>Ahfeldt</w:t>
+      </w:r>
+      <w:proofErr w:type="spellEnd"/>
+      <w:r>
+        <w:t xml:space="preserve"> et al (2015); Burchardi and Hassan (2011); </w:t>
+      </w:r>
+      <w:proofErr w:type="spellStart"/>
+      <w:r>
+        <w:t>Kottasova</w:t>
+      </w:r>
+      <w:proofErr w:type="spellEnd"/>
+      <w:r>
+        <w:t xml:space="preserve"> and Croker (2019))</w:t>
+      </w:r>
+      <w:r>
+        <w:t xml:space="preserve">. </w:t>
+      </w:r>
+      <w:r>
+        <w:t>Thus</w:t>
+      </w:r>
+      <w:r>
+        <w:t xml:space="preserve">, the extreme degree of similarity between East and West Berlin </w:t>
+      </w:r>
+      <w:r>
+        <w:t xml:space="preserve">Airbnb market </w:t>
+      </w:r>
+      <w:r>
+        <w:t xml:space="preserve">given the division, is </w:t>
+      </w:r>
+      <w:r>
+        <w:t xml:space="preserve">at minimal, </w:t>
+      </w:r>
+      <w:r>
+        <w:t xml:space="preserve">interesting. </w:t>
+      </w:r>
+      <w:r>
+        <w:t>Overall, the results indicate that the effect of the Berlin Wall</w:t>
+      </w:r>
+      <w:r>
+        <w:t xml:space="preserve"> on the Airbnb</w:t>
+      </w:r>
+      <w:r>
+        <w:t xml:space="preserve"> </w:t>
+      </w:r>
+      <w:r>
+        <w:t xml:space="preserve">market </w:t>
+      </w:r>
+      <w:r>
+        <w:t>has fade</w:t>
+      </w:r>
+      <w:r>
+        <w:t>d or never persisted.</w:t>
+      </w:r>
+      <w:r>
+        <w:t xml:space="preserve"> </w:t>
+      </w:r>
+    </w:p>
+    <w:p>
+      <w:pPr>
         <w:rPr>
           <w:rFonts w:eastAsia="Times New Roman" w:cs="Times New Roman"/>
           <w:kern w:val="0"/>
-          <w:sz w:val="24"/>
-          <w:szCs w:val="24"/>
+          <w:sz w:val="22"/>
           <w14:ligatures w14:val="none"/>
         </w:rPr>
       </w:pPr>
-      <w:r>
-        <w:rPr>
-          <w:b/>
-          <w:bCs/>
-        </w:rPr>
-        <w:t>Amenity Descriptions:</w:t>
-      </w:r>
-      <w:r>
-        <w:t xml:space="preserve"> </w:t>
-      </w:r>
       <w:r>
         <w:rPr>
           <w:rFonts w:eastAsia="Times New Roman" w:cs="Times New Roman"/>
           <w:kern w:val="0"/>
-          <w:sz w:val="24"/>
-          <w:szCs w:val="24"/>
-          <w14:ligatures w14:val="none"/>
-        </w:rPr>
-        <w:t>Amenities offered in Airbnb listings can influence guest decisions and may potentially reflect lingering spatial patterns rooted in the historical East–West division of Berlin. If this division shape</w:t>
-      </w:r>
-      <w:r>
-        <w:rPr>
-          <w:rFonts w:eastAsia="Times New Roman" w:cs="Times New Roman"/>
-          <w:kern w:val="0"/>
-          <w:sz w:val="24"/>
-          <w:szCs w:val="24"/>
-          <w14:ligatures w14:val="none"/>
-        </w:rPr>
-        <w:t>d</w:t>
-      </w:r>
-      <w:r>
-        <w:rPr>
-          <w:rFonts w:eastAsia="Times New Roman" w:cs="Times New Roman"/>
-          <w:kern w:val="0"/>
-          <w:sz w:val="24"/>
-          <w:szCs w:val="24"/>
-          <w14:ligatures w14:val="none"/>
-        </w:rPr>
-        <w:t xml:space="preserve"> the housing market—through infrastructure, policy, or other channels—it could be reflected in the types or quantities of amenities provided. However, our analysis finds no significant difference in the ten most frequently listed amenities across the former divide. These include Wi-Fi, kitchen, heating, essentials, washer, dryer, hair dryer, alarm, smoke detector, and hot water. This similarity is unsurprising, given Berlin’s level of economic development and the fact that these amenities are </w:t>
-      </w:r>
-      <w:r>
-        <w:rPr>
-          <w:rFonts w:eastAsia="Times New Roman" w:cs="Times New Roman"/>
-          <w:kern w:val="0"/>
-          <w:sz w:val="24"/>
-          <w:szCs w:val="24"/>
-          <w14:ligatures w14:val="none"/>
-        </w:rPr>
-        <w:t>normal</w:t>
-      </w:r>
-      <w:r>
-        <w:rPr>
-          <w:rFonts w:eastAsia="Times New Roman" w:cs="Times New Roman"/>
-          <w:kern w:val="0"/>
-          <w:sz w:val="24"/>
-          <w:szCs w:val="24"/>
-          <w14:ligatures w14:val="none"/>
-        </w:rPr>
-        <w:t xml:space="preserve"> goods.</w:t>
-      </w:r>
-    </w:p>
-    <w:p>
-      <w:pPr>
-        <w:spacing w:before="100" w:beforeAutospacing="1" w:after="100" w:afterAutospacing="1" w:line="240" w:lineRule="auto"/>
-        <w:ind w:firstLine="720"/>
-        <w:rPr>
-          <w:rFonts w:eastAsia="Times New Roman" w:cs="Times New Roman"/>
-          <w:kern w:val="0"/>
-          <w:sz w:val="24"/>
-          <w:szCs w:val="24"/>
-          <w14:ligatures w14:val="none"/>
-        </w:rPr>
-      </w:pPr>
-      <w:r>
-        <w:rPr>
-          <w:rFonts w:eastAsia="Times New Roman" w:cs="Times New Roman"/>
-          <w:kern w:val="0"/>
-          <w:sz w:val="24"/>
-          <w:szCs w:val="24"/>
-          <w14:ligatures w14:val="none"/>
-        </w:rPr>
-        <w:t>We also explored the use of sentiment analysis on amenity listings but found it to be an unsuitable method in this context. By design, amenities are intended to convey positive features, yet the sentiment tool can misclassify them due to isolated word associations. For instance, an Airbnb listing that includes “fire extinguisher,” “kitchen,” “smoke,” “alarm,” “TV,” “washer,” and “Wi-Fi”</w:t>
-      </w:r>
-      <w:r>
-        <w:rPr>
-          <w:rFonts w:eastAsia="Times New Roman" w:cs="Times New Roman"/>
-          <w:kern w:val="0"/>
-          <w:sz w:val="24"/>
-          <w:szCs w:val="24"/>
-          <w14:ligatures w14:val="none"/>
-        </w:rPr>
-        <w:t xml:space="preserve"> as their amenities</w:t>
-      </w:r>
-      <w:r>
-        <w:rPr>
-          <w:rFonts w:eastAsia="Times New Roman" w:cs="Times New Roman"/>
-          <w:kern w:val="0"/>
-          <w:sz w:val="24"/>
-          <w:szCs w:val="24"/>
-          <w14:ligatures w14:val="none"/>
-        </w:rPr>
-        <w:t xml:space="preserve"> received a sentiment score of –0.59. This likely results from negative </w:t>
-      </w:r>
-      <w:r>
-        <w:rPr>
-          <w:rFonts w:eastAsia="Times New Roman" w:cs="Times New Roman"/>
-          <w:kern w:val="0"/>
-          <w:sz w:val="24"/>
-          <w:szCs w:val="24"/>
-          <w14:ligatures w14:val="none"/>
-        </w:rPr>
-        <w:t xml:space="preserve">values </w:t>
-      </w:r>
-      <w:r>
-        <w:rPr>
-          <w:rFonts w:eastAsia="Times New Roman" w:cs="Times New Roman"/>
-          <w:kern w:val="0"/>
-          <w:sz w:val="24"/>
-          <w:szCs w:val="24"/>
-          <w14:ligatures w14:val="none"/>
-        </w:rPr>
-        <w:t xml:space="preserve">assigned to words like “fire,” “extinguisher,” “alarm,” and “smoke,” despite these features </w:t>
-      </w:r>
-      <w:r>
-        <w:rPr>
-          <w:rFonts w:eastAsia="Times New Roman" w:cs="Times New Roman"/>
-          <w:kern w:val="0"/>
-          <w:sz w:val="24"/>
-          <w:szCs w:val="24"/>
-          <w14:ligatures w14:val="none"/>
-        </w:rPr>
-        <w:t xml:space="preserve">potentially </w:t>
-      </w:r>
-      <w:r>
-        <w:rPr>
-          <w:rFonts w:eastAsia="Times New Roman" w:cs="Times New Roman"/>
-          <w:kern w:val="0"/>
-          <w:sz w:val="24"/>
-          <w:szCs w:val="24"/>
-          <w14:ligatures w14:val="none"/>
-        </w:rPr>
-        <w:t>signaling safety and quality to guests. Therefore, we conclude that sentiment analysis does not reliably capture the intended meaning or guest perception of amenity listings.</w:t>
-      </w:r>
-    </w:p>
-    <w:p>
-      <w:pPr>
-        <w:rPr>
-          <w:sz w:val="24"/>
-          <w:szCs w:val="24"/>
-        </w:rPr>
-      </w:pPr>
-      <w:r>
-        <w:rPr>
-          <w:b/>
-          <w:bCs/>
-        </w:rPr>
-        <w:t xml:space="preserve">Host Descriptions: </w:t>
-      </w:r>
-      <w:r>
-        <w:rPr>
-          <w:sz w:val="24"/>
-          <w:szCs w:val="24"/>
-        </w:rPr>
-        <w:t xml:space="preserve">If there remain meaningful sociodemographic differences between East and West Berlin—potentially as a legacy of the city's historical division—then such differences might manifest in the language used by hosts to describe their listings. This hypothesis assumes, however, that Airbnb hosts typically operate within a single geographic area and do not maintain listings on both sides of the former divide. Even under this assumption, our analysis reveals no meaningful differences in host description language between East and West Berlin. </w:t>
-      </w:r>
-    </w:p>
-    <w:p>
-      <w:pPr>
-        <w:ind w:firstLine="720"/>
-        <w:rPr>
-          <w:sz w:val="24"/>
-          <w:szCs w:val="24"/>
-        </w:rPr>
-      </w:pPr>
-      <w:r>
-        <w:rPr>
-          <w:sz w:val="24"/>
-          <w:szCs w:val="24"/>
-        </w:rPr>
-        <w:lastRenderedPageBreak/>
-        <w:t xml:space="preserve">As with </w:t>
-      </w:r>
-      <w:r>
-        <w:rPr>
-          <w:sz w:val="24"/>
-          <w:szCs w:val="24"/>
-        </w:rPr>
-        <w:t>amenity descriptions</w:t>
-      </w:r>
-      <w:r>
-        <w:rPr>
-          <w:sz w:val="24"/>
-          <w:szCs w:val="24"/>
-        </w:rPr>
-        <w:t xml:space="preserve">, we attempted a sentiment analysis of host descriptions to further investigate potential differences. </w:t>
-      </w:r>
-      <w:bookmarkStart w:id="0" w:name="_Hlk198218115"/>
-      <w:r>
-        <w:rPr>
-          <w:sz w:val="24"/>
-          <w:szCs w:val="24"/>
-        </w:rPr>
-        <w:t>However, we found that sentiment analysis tools did not perform reliably on this category of text.</w:t>
-      </w:r>
-      <w:bookmarkEnd w:id="0"/>
-      <w:r>
-        <w:rPr>
-          <w:sz w:val="24"/>
-          <w:szCs w:val="24"/>
-        </w:rPr>
-        <w:t xml:space="preserve"> For example, the phrase: “Forget your worries in this spacious and quiet space” </w:t>
-      </w:r>
-      <w:r>
-        <w:rPr>
-          <w:sz w:val="24"/>
-          <w:szCs w:val="24"/>
-        </w:rPr>
-        <w:t>received</w:t>
-      </w:r>
-      <w:r>
-        <w:rPr>
-          <w:sz w:val="24"/>
-          <w:szCs w:val="24"/>
-        </w:rPr>
-        <w:t xml:space="preserve"> a sentiment score of –0.57, erroneously implying a strongly negative sentiment. We attribute this misclassification to the sentiment analysis model's treatment of individual words such as “forget” and “worries”, which are weighted negatively in isolation. However, in context, the phrase clearly conveys a positive </w:t>
-      </w:r>
-      <w:r>
-        <w:rPr>
-          <w:sz w:val="24"/>
-          <w:szCs w:val="24"/>
-        </w:rPr>
-        <w:t>message</w:t>
-      </w:r>
-      <w:r>
-        <w:rPr>
-          <w:sz w:val="24"/>
-          <w:szCs w:val="24"/>
-        </w:rPr>
-        <w:t xml:space="preserve">. Due to </w:t>
-      </w:r>
-      <w:r>
-        <w:rPr>
-          <w:sz w:val="24"/>
-          <w:szCs w:val="24"/>
-        </w:rPr>
-        <w:t>this misalignment</w:t>
-      </w:r>
-      <w:r>
-        <w:rPr>
-          <w:sz w:val="24"/>
-          <w:szCs w:val="24"/>
-        </w:rPr>
-        <w:t xml:space="preserve">, we conclude that </w:t>
-      </w:r>
-      <w:r>
-        <w:rPr>
-          <w:sz w:val="24"/>
-          <w:szCs w:val="24"/>
-        </w:rPr>
-        <w:t>a</w:t>
-      </w:r>
-      <w:r>
-        <w:rPr>
-          <w:sz w:val="24"/>
-          <w:szCs w:val="24"/>
-        </w:rPr>
-        <w:t xml:space="preserve"> sentiment analysis tool</w:t>
-      </w:r>
-      <w:r>
-        <w:rPr>
-          <w:sz w:val="24"/>
-          <w:szCs w:val="24"/>
-        </w:rPr>
-        <w:t xml:space="preserve"> is</w:t>
-      </w:r>
-      <w:r>
-        <w:rPr>
-          <w:sz w:val="24"/>
-          <w:szCs w:val="24"/>
-        </w:rPr>
-        <w:t xml:space="preserve"> not well-suited for evaluating </w:t>
-      </w:r>
-      <w:r>
-        <w:rPr>
-          <w:sz w:val="24"/>
-          <w:szCs w:val="24"/>
-        </w:rPr>
-        <w:t xml:space="preserve">Airbnb </w:t>
-      </w:r>
-      <w:r>
-        <w:rPr>
-          <w:sz w:val="24"/>
-          <w:szCs w:val="24"/>
-        </w:rPr>
-        <w:t>host-generated marketing language. As a result, we do not present further sentiment-based findings from host descriptions.</w:t>
-      </w:r>
-    </w:p>
-    <w:p>
-      <w:pPr>
-        <w:ind w:firstLine="720"/>
-        <w:rPr>
-          <w:sz w:val="24"/>
-          <w:szCs w:val="24"/>
-        </w:rPr>
-      </w:pPr>
-      <w:proofErr w:type="gramStart"/>
-      <w:r>
-        <w:rPr>
-          <w:sz w:val="24"/>
-          <w:szCs w:val="24"/>
-        </w:rPr>
-        <w:t>Similar</w:t>
-      </w:r>
-      <w:r>
-        <w:rPr>
-          <w:sz w:val="24"/>
-          <w:szCs w:val="24"/>
-        </w:rPr>
-        <w:t xml:space="preserve"> to</w:t>
-      </w:r>
-      <w:proofErr w:type="gramEnd"/>
-      <w:r>
-        <w:rPr>
-          <w:sz w:val="24"/>
-          <w:szCs w:val="24"/>
-        </w:rPr>
-        <w:t xml:space="preserve"> our descriptive analysis, the </w:t>
-      </w:r>
-      <w:r>
-        <w:rPr>
-          <w:sz w:val="24"/>
-          <w:szCs w:val="24"/>
-        </w:rPr>
-        <w:t>preliminary</w:t>
-      </w:r>
-      <w:r>
-        <w:rPr>
-          <w:sz w:val="24"/>
-          <w:szCs w:val="24"/>
-        </w:rPr>
-        <w:t xml:space="preserve"> </w:t>
-      </w:r>
-      <w:r>
-        <w:rPr>
-          <w:sz w:val="24"/>
-          <w:szCs w:val="24"/>
-        </w:rPr>
-        <w:t xml:space="preserve">text and </w:t>
-      </w:r>
-      <w:r>
-        <w:rPr>
-          <w:sz w:val="24"/>
-          <w:szCs w:val="24"/>
-        </w:rPr>
-        <w:t>sentiment analys</w:t>
-      </w:r>
-      <w:r>
-        <w:rPr>
-          <w:sz w:val="24"/>
-          <w:szCs w:val="24"/>
-        </w:rPr>
-        <w:t>e</w:t>
-      </w:r>
-      <w:r>
-        <w:rPr>
-          <w:sz w:val="24"/>
-          <w:szCs w:val="24"/>
-        </w:rPr>
-        <w:t>s find</w:t>
-      </w:r>
-      <w:r>
-        <w:rPr>
-          <w:sz w:val="24"/>
-          <w:szCs w:val="24"/>
-        </w:rPr>
-        <w:t>s</w:t>
-      </w:r>
-      <w:r>
-        <w:rPr>
-          <w:sz w:val="24"/>
-          <w:szCs w:val="24"/>
-        </w:rPr>
-        <w:t xml:space="preserve"> </w:t>
-      </w:r>
-      <w:r>
-        <w:rPr>
-          <w:sz w:val="24"/>
-          <w:szCs w:val="24"/>
-        </w:rPr>
-        <w:t xml:space="preserve">no </w:t>
-      </w:r>
-      <w:r>
-        <w:rPr>
-          <w:sz w:val="24"/>
-          <w:szCs w:val="24"/>
-        </w:rPr>
-        <w:t>meaningful difference in the Airbnb market of East and West Berlin</w:t>
-      </w:r>
-      <w:r>
-        <w:rPr>
-          <w:sz w:val="24"/>
-          <w:szCs w:val="24"/>
-        </w:rPr>
-        <w:t>.</w:t>
-      </w:r>
-    </w:p>
-    <w:p/>
-    <w:p>
-      <w:pPr>
-        <w:pStyle w:val="Heading2"/>
-      </w:pPr>
-      <w:r>
-        <w:t>Conclusion</w:t>
-      </w:r>
-    </w:p>
-    <w:p>
-      <w:pPr>
-        <w:spacing w:before="100" w:beforeAutospacing="1" w:after="100" w:afterAutospacing="1" w:line="240" w:lineRule="auto"/>
-        <w:rPr>
-          <w:sz w:val="24"/>
-          <w:szCs w:val="24"/>
-        </w:rPr>
-      </w:pPr>
-      <w:r>
-        <w:rPr>
-          <w:sz w:val="24"/>
-          <w:szCs w:val="24"/>
-        </w:rPr>
-        <w:t>This study</w:t>
-      </w:r>
-      <w:r>
-        <w:rPr>
-          <w:sz w:val="24"/>
-          <w:szCs w:val="24"/>
-        </w:rPr>
-        <w:t xml:space="preserve"> preliminarily</w:t>
-      </w:r>
-      <w:r>
-        <w:rPr>
-          <w:sz w:val="24"/>
-          <w:szCs w:val="24"/>
-        </w:rPr>
-        <w:t xml:space="preserve"> examines the characteristics of Airbnb listings in East and West Berlin using data from the December 2024 release of Inside Airbnb. Despite the city’s historical division, our analysis reveals substantial similarities across both regions in terms of Airbnb attributes. Prices per night, average review ratings, room type distributions, and licensure rates show no significant differences between East and West Berlin. Even </w:t>
-      </w:r>
-      <w:r>
-        <w:rPr>
-          <w:sz w:val="24"/>
-          <w:szCs w:val="24"/>
-        </w:rPr>
-        <w:t xml:space="preserve">by applying a </w:t>
-      </w:r>
-      <w:r>
-        <w:rPr>
-          <w:sz w:val="24"/>
-          <w:szCs w:val="24"/>
-        </w:rPr>
-        <w:t>within 2-kilometer buffer of the former Berlin Wall, listing characteristics remain comparable</w:t>
-      </w:r>
-      <w:r>
-        <w:rPr>
-          <w:sz w:val="24"/>
-          <w:szCs w:val="24"/>
-        </w:rPr>
-        <w:t xml:space="preserve"> within and outside of the 2-kilometer</w:t>
-      </w:r>
-      <w:r>
-        <w:rPr>
-          <w:sz w:val="24"/>
-          <w:szCs w:val="24"/>
-        </w:rPr>
-        <w:t>. Sentiment analysis of guest reviews also shows no meaningful divergence in tone or content across the two sides.</w:t>
-      </w:r>
-    </w:p>
-    <w:p>
-      <w:pPr>
-        <w:spacing w:before="100" w:beforeAutospacing="1" w:after="100" w:afterAutospacing="1" w:line="240" w:lineRule="auto"/>
-        <w:ind w:firstLine="720"/>
-        <w:rPr>
-          <w:sz w:val="24"/>
-          <w:szCs w:val="24"/>
-        </w:rPr>
-      </w:pPr>
-      <w:r>
-        <w:rPr>
-          <w:sz w:val="24"/>
-          <w:szCs w:val="24"/>
-        </w:rPr>
-        <w:t xml:space="preserve">Interestingly, this convergence occurs despite ongoing </w:t>
-      </w:r>
-      <w:r>
-        <w:rPr>
-          <w:sz w:val="24"/>
-          <w:szCs w:val="24"/>
-        </w:rPr>
-        <w:t xml:space="preserve">household </w:t>
-      </w:r>
-      <w:r>
-        <w:rPr>
-          <w:sz w:val="24"/>
-          <w:szCs w:val="24"/>
-        </w:rPr>
-        <w:t xml:space="preserve">differences in East and West </w:t>
-      </w:r>
-      <w:r>
-        <w:rPr>
-          <w:sz w:val="24"/>
-          <w:szCs w:val="24"/>
-        </w:rPr>
-        <w:t xml:space="preserve">Germany </w:t>
-      </w:r>
-      <w:proofErr w:type="gramStart"/>
-      <w:r>
-        <w:rPr>
-          <w:sz w:val="24"/>
-          <w:szCs w:val="24"/>
-        </w:rPr>
-        <w:t xml:space="preserve">still </w:t>
-      </w:r>
-      <w:r>
-        <w:rPr>
-          <w:sz w:val="24"/>
-          <w:szCs w:val="24"/>
-        </w:rPr>
-        <w:t>persisting</w:t>
-      </w:r>
-      <w:proofErr w:type="gramEnd"/>
-      <w:r>
-        <w:rPr>
-          <w:sz w:val="24"/>
-          <w:szCs w:val="24"/>
-        </w:rPr>
-        <w:t xml:space="preserve"> from the former Berlin Wall</w:t>
-      </w:r>
-      <w:r>
-        <w:rPr>
-          <w:sz w:val="24"/>
-          <w:szCs w:val="24"/>
-        </w:rPr>
-        <w:t xml:space="preserve"> </w:t>
-      </w:r>
-      <w:r>
-        <w:t>(</w:t>
-      </w:r>
-      <w:proofErr w:type="spellStart"/>
-      <w:r>
-        <w:t>Ahfeldt</w:t>
-      </w:r>
-      <w:proofErr w:type="spellEnd"/>
-      <w:r>
-        <w:t xml:space="preserve"> et al (2015); Burchardi and Hassan (2011); </w:t>
-      </w:r>
-      <w:proofErr w:type="spellStart"/>
-      <w:r>
-        <w:rPr>
-          <w:sz w:val="24"/>
-          <w:szCs w:val="24"/>
-        </w:rPr>
-        <w:t>Kottasova</w:t>
-      </w:r>
-      <w:proofErr w:type="spellEnd"/>
-      <w:r>
-        <w:rPr>
-          <w:sz w:val="24"/>
-          <w:szCs w:val="24"/>
-        </w:rPr>
-        <w:t xml:space="preserve"> and Croker (2019)</w:t>
-      </w:r>
-      <w:r>
-        <w:t>)</w:t>
-      </w:r>
-      <w:r>
-        <w:rPr>
-          <w:sz w:val="24"/>
-          <w:szCs w:val="24"/>
-        </w:rPr>
-        <w:t xml:space="preserve">. </w:t>
-      </w:r>
-      <w:r>
-        <w:rPr>
-          <w:sz w:val="24"/>
-          <w:szCs w:val="24"/>
-        </w:rPr>
-        <w:t>Thus</w:t>
-      </w:r>
-      <w:r>
-        <w:rPr>
-          <w:sz w:val="24"/>
-          <w:szCs w:val="24"/>
-        </w:rPr>
-        <w:t xml:space="preserve">, the extreme degree of similarity between East and West Berlin </w:t>
-      </w:r>
-      <w:r>
-        <w:rPr>
-          <w:sz w:val="24"/>
-          <w:szCs w:val="24"/>
-        </w:rPr>
-        <w:t xml:space="preserve">Airbnb market </w:t>
-      </w:r>
-      <w:r>
-        <w:rPr>
-          <w:sz w:val="24"/>
-          <w:szCs w:val="24"/>
-        </w:rPr>
-        <w:t xml:space="preserve">given the division, is </w:t>
-      </w:r>
-      <w:r>
-        <w:rPr>
-          <w:sz w:val="24"/>
-          <w:szCs w:val="24"/>
-        </w:rPr>
-        <w:t xml:space="preserve">at minimal, </w:t>
-      </w:r>
-      <w:r>
-        <w:rPr>
-          <w:sz w:val="24"/>
-          <w:szCs w:val="24"/>
-        </w:rPr>
-        <w:t xml:space="preserve">interesting. </w:t>
-      </w:r>
-      <w:r>
-        <w:rPr>
-          <w:sz w:val="24"/>
-          <w:szCs w:val="24"/>
-        </w:rPr>
-        <w:t>Overall, the results indicate that the effect of the Berlin Wall</w:t>
-      </w:r>
-      <w:r>
-        <w:rPr>
-          <w:sz w:val="24"/>
-          <w:szCs w:val="24"/>
-        </w:rPr>
-        <w:t xml:space="preserve"> on the Airbnb</w:t>
-      </w:r>
-      <w:r>
-        <w:rPr>
-          <w:sz w:val="24"/>
-          <w:szCs w:val="24"/>
-        </w:rPr>
-        <w:t xml:space="preserve"> </w:t>
-      </w:r>
-      <w:r>
-        <w:rPr>
-          <w:sz w:val="24"/>
-          <w:szCs w:val="24"/>
-        </w:rPr>
-        <w:t xml:space="preserve">market </w:t>
-      </w:r>
-      <w:r>
-        <w:rPr>
-          <w:sz w:val="24"/>
-          <w:szCs w:val="24"/>
-        </w:rPr>
-        <w:t>has fade</w:t>
-      </w:r>
-      <w:r>
-        <w:rPr>
-          <w:sz w:val="24"/>
-          <w:szCs w:val="24"/>
-        </w:rPr>
-        <w:t>d or never persisted.</w:t>
-      </w:r>
-      <w:r>
-        <w:rPr>
-          <w:sz w:val="24"/>
-          <w:szCs w:val="24"/>
-        </w:rPr>
-        <w:t xml:space="preserve"> </w:t>
-      </w:r>
-    </w:p>
-    <w:p>
-      <w:pPr>
-        <w:rPr>
-          <w:rFonts w:eastAsia="Times New Roman" w:cs="Times New Roman"/>
-          <w:kern w:val="0"/>
-          <w:sz w:val="24"/>
-          <w:szCs w:val="24"/>
-          <w14:ligatures w14:val="none"/>
-        </w:rPr>
-      </w:pPr>
-      <w:r>
-        <w:rPr>
-          <w:rFonts w:eastAsia="Times New Roman" w:cs="Times New Roman"/>
-          <w:kern w:val="0"/>
-          <w:sz w:val="24"/>
-          <w:szCs w:val="24"/>
+          <w:sz w:val="22"/>
           <w14:ligatures w14:val="none"/>
         </w:rPr>
         <w:br w:type="page"/>
@@ -2813,7 +2194,8 @@
       </w:sdtPr>
       <w:sdtEndPr>
         <w:rPr>
-          <w:rFonts w:ascii="Times New Roman" w:eastAsiaTheme="minorHAnsi" w:hAnsi="Times New Roman" w:cstheme="minorBidi"/>
+          <w:rFonts w:eastAsiaTheme="minorHAnsi" w:cstheme="minorBidi"/>
+          <w:b w:val="0"/>
           <w:color w:val="auto"/>
           <w:sz w:val="22"/>
           <w:szCs w:val="22"/>
@@ -2822,109 +2204,50 @@
       <w:sdtContent>
         <w:p>
           <w:pPr>
-            <w:pStyle w:val="Heading1"/>
+            <w:pStyle w:val="Heading2"/>
           </w:pPr>
           <w:r>
             <w:t>References</w:t>
           </w:r>
         </w:p>
+        <w:p/>
       </w:sdtContent>
     </w:sdt>
     <w:p>
-      <w:pPr>
-        <w:spacing w:before="100" w:beforeAutospacing="1" w:after="100" w:afterAutospacing="1" w:line="240" w:lineRule="auto"/>
-        <w:rPr>
-          <w:sz w:val="24"/>
-          <w:szCs w:val="24"/>
-        </w:rPr>
-      </w:pPr>
       <w:proofErr w:type="spellStart"/>
       <w:r>
-        <w:rPr>
-          <w:sz w:val="24"/>
-          <w:szCs w:val="24"/>
-        </w:rPr>
         <w:t>Ahlfeldt</w:t>
       </w:r>
       <w:proofErr w:type="spellEnd"/>
       <w:r>
-        <w:rPr>
-          <w:sz w:val="24"/>
-          <w:szCs w:val="24"/>
-        </w:rPr>
         <w:t xml:space="preserve">, G. M., Redding, S. J., Sturm, D. M., &amp; Wolf, N. (2015). The economics of density: Evidence from the Berlin Wall. </w:t>
       </w:r>
       <w:proofErr w:type="spellStart"/>
       <w:r>
-        <w:rPr>
-          <w:sz w:val="24"/>
-          <w:szCs w:val="24"/>
-        </w:rPr>
         <w:t>Econometrica</w:t>
       </w:r>
       <w:proofErr w:type="spellEnd"/>
       <w:r>
-        <w:rPr>
-          <w:sz w:val="24"/>
-          <w:szCs w:val="24"/>
-        </w:rPr>
         <w:t>, 83(6), 2127–2189.</w:t>
       </w:r>
     </w:p>
     <w:p>
-      <w:pPr>
-        <w:spacing w:before="100" w:beforeAutospacing="1" w:after="100" w:afterAutospacing="1" w:line="240" w:lineRule="auto"/>
-        <w:rPr>
-          <w:sz w:val="24"/>
-          <w:szCs w:val="24"/>
-        </w:rPr>
-      </w:pPr>
-      <w:r>
-        <w:rPr>
-          <w:sz w:val="24"/>
-          <w:szCs w:val="24"/>
-        </w:rPr>
+      <w:r>
         <w:t>Burchardi, K. B., &amp; Hassan, T. A. (2013). The economic impact of social ties: Evidence from German reunification. The Quarterly Journal of Economics, 128(3), 1219–1271. https://www.jstor.org/stable/26372522</w:t>
       </w:r>
     </w:p>
     <w:p>
-      <w:pPr>
-        <w:spacing w:before="100" w:beforeAutospacing="1" w:after="100" w:afterAutospacing="1" w:line="240" w:lineRule="auto"/>
-        <w:rPr>
-          <w:sz w:val="24"/>
-          <w:szCs w:val="24"/>
-        </w:rPr>
-      </w:pPr>
-      <w:r>
-        <w:rPr>
-          <w:sz w:val="24"/>
-          <w:szCs w:val="24"/>
-        </w:rPr>
+      <w:r>
         <w:t>Inside Airbnb. (n.d.). Data downloads. https://insideairbnb.com/</w:t>
       </w:r>
     </w:p>
     <w:p>
-      <w:pPr>
-        <w:spacing w:before="100" w:beforeAutospacing="1" w:after="100" w:afterAutospacing="1" w:line="240" w:lineRule="auto"/>
-        <w:rPr>
-          <w:sz w:val="24"/>
-          <w:szCs w:val="24"/>
-        </w:rPr>
-      </w:pPr>
       <w:proofErr w:type="spellStart"/>
       <w:r>
-        <w:rPr>
-          <w:sz w:val="24"/>
-          <w:szCs w:val="24"/>
-        </w:rPr>
         <w:t>Kottasova</w:t>
       </w:r>
       <w:proofErr w:type="spellEnd"/>
       <w:r>
-        <w:rPr>
-          <w:sz w:val="24"/>
-          <w:szCs w:val="24"/>
-        </w:rPr>
         <w:t>, I., &amp; Croker, N. (2019, November 7). The Berlin Wall fell 30 years ago. But an invisible barrier still divides Germany. CNN. https://www.cnn.com/2019/11/07/europe/berlin-wall-fall-30th-anniversary-intl-grm</w:t>
       </w:r>
     </w:p>
@@ -2934,7 +2257,6 @@
         <w:rPr>
           <w:rFonts w:eastAsia="Times New Roman" w:cs="Times New Roman"/>
           <w:kern w:val="0"/>
-          <w:sz w:val="24"/>
           <w:szCs w:val="24"/>
           <w14:ligatures w14:val="none"/>
         </w:rPr>
@@ -2953,7 +2275,7 @@
 </file>
 
 <file path=word/endnotes.xml><?xml version="1.0" encoding="utf-8"?>
-<w:endnotes xmlns:wpc="http://schemas.microsoft.com/office/word/2010/wordprocessingCanvas" xmlns:cx="http://schemas.microsoft.com/office/drawing/2014/chartex" xmlns:cx1="http://schemas.microsoft.com/office/drawing/2015/9/8/chartex" xmlns:cx2="http://schemas.microsoft.com/office/drawing/2015/10/21/chartex" xmlns:cx3="http://schemas.microsoft.com/office/drawing/2016/5/9/chartex" xmlns:cx4="http://schemas.microsoft.com/office/drawing/2016/5/10/chartex" xmlns:cx5="http://schemas.microsoft.com/office/drawing/2016/5/11/chartex" xmlns:cx6="http://schemas.microsoft.com/office/drawing/2016/5/12/chartex" xmlns:cx7="http://schemas.microsoft.com/office/drawing/2016/5/13/chartex" xmlns:cx8="http://schemas.microsoft.com/office/drawing/2016/5/14/chartex" xmlns:mc="http://schemas.openxmlformats.org/markup-compatibility/2006" xmlns:aink="http://schemas.microsoft.com/office/drawing/2016/ink" xmlns:am3d="http://schemas.microsoft.com/office/drawing/2017/model3d" xmlns:o="urn:schemas-microsoft-com:office:office" xmlns:oel="http://schemas.microsoft.com/office/2019/extlst" xmlns:r="http://schemas.openxmlformats.org/officeDocument/2006/relationships" xmlns:m="http://schemas.openxmlformats.org/officeDocument/2006/math" xmlns:v="urn:schemas-microsoft-com:vml" xmlns:wp14="http://schemas.microsoft.com/office/word/2010/wordprocessingDrawing" xmlns:wp="http://schemas.openxmlformats.org/drawingml/2006/wordprocessingDrawing" xmlns:w10="urn:schemas-microsoft-com:office:word" xmlns:w="http://schemas.openxmlformats.org/wordprocessingml/2006/main" xmlns:w14="http://schemas.microsoft.com/office/word/2010/wordml" xmlns:w15="http://schemas.microsoft.com/office/word/2012/wordml" xmlns:w16cex="http://schemas.microsoft.com/office/word/2018/wordml/cex" xmlns:w16cid="http://schemas.microsoft.com/office/word/2016/wordml/cid" xmlns:w16="http://schemas.microsoft.com/office/word/2018/wordml" xmlns:w16du="http://schemas.microsoft.com/office/word/2023/wordml/word16du" xmlns:w16sdtdh="http://schemas.microsoft.com/office/word/2020/wordml/sdtdatahash" xmlns:w16se="http://schemas.microsoft.com/office/word/2015/wordml/symex" xmlns:wpg="http://schemas.microsoft.com/office/word/2010/wordprocessingGroup" xmlns:wpi="http://schemas.microsoft.com/office/word/2010/wordprocessingInk" xmlns:wne="http://schemas.microsoft.com/office/word/2006/wordml" xmlns:wps="http://schemas.microsoft.com/office/word/2010/wordprocessingShape" mc:Ignorable="w14 w15 w16se w16cid w16 w16cex w16sdtdh w16du wp14">
+<w:endnotes xmlns:wpc="http://schemas.microsoft.com/office/word/2010/wordprocessingCanvas" xmlns:cx="http://schemas.microsoft.com/office/drawing/2014/chartex" xmlns:cx1="http://schemas.microsoft.com/office/drawing/2015/9/8/chartex" xmlns:cx2="http://schemas.microsoft.com/office/drawing/2015/10/21/chartex" xmlns:cx3="http://schemas.microsoft.com/office/drawing/2016/5/9/chartex" xmlns:cx4="http://schemas.microsoft.com/office/drawing/2016/5/10/chartex" xmlns:cx5="http://schemas.microsoft.com/office/drawing/2016/5/11/chartex" xmlns:cx6="http://schemas.microsoft.com/office/drawing/2016/5/12/chartex" xmlns:cx7="http://schemas.microsoft.com/office/drawing/2016/5/13/chartex" xmlns:cx8="http://schemas.microsoft.com/office/drawing/2016/5/14/chartex" xmlns:mc="http://schemas.openxmlformats.org/markup-compatibility/2006" xmlns:aink="http://schemas.microsoft.com/office/drawing/2016/ink" xmlns:am3d="http://schemas.microsoft.com/office/drawing/2017/model3d" xmlns:o="urn:schemas-microsoft-com:office:office" xmlns:oel="http://schemas.microsoft.com/office/2019/extlst" xmlns:r="http://schemas.openxmlformats.org/officeDocument/2006/relationships" xmlns:m="http://schemas.openxmlformats.org/officeDocument/2006/math" xmlns:v="urn:schemas-microsoft-com:vml" xmlns:wp14="http://schemas.microsoft.com/office/word/2010/wordprocessingDrawing" xmlns:wp="http://schemas.openxmlformats.org/drawingml/2006/wordprocessingDrawing" xmlns:w10="urn:schemas-microsoft-com:office:word" xmlns:w="http://schemas.openxmlformats.org/wordprocessingml/2006/main" xmlns:w14="http://schemas.microsoft.com/office/word/2010/wordml" xmlns:w15="http://schemas.microsoft.com/office/word/2012/wordml" xmlns:w16cex="http://schemas.microsoft.com/office/word/2018/wordml/cex" xmlns:w16cid="http://schemas.microsoft.com/office/word/2016/wordml/cid" xmlns:w16="http://schemas.microsoft.com/office/word/2018/wordml" xmlns:w16du="http://schemas.microsoft.com/office/word/2023/wordml/word16du" xmlns:w16sdtdh="http://schemas.microsoft.com/office/word/2020/wordml/sdtdatahash" xmlns:w16sdtfl="http://schemas.microsoft.com/office/word/2024/wordml/sdtformatlock" xmlns:w16se="http://schemas.microsoft.com/office/word/2015/wordml/symex" xmlns:wpg="http://schemas.microsoft.com/office/word/2010/wordprocessingGroup" xmlns:wpi="http://schemas.microsoft.com/office/word/2010/wordprocessingInk" xmlns:wne="http://schemas.microsoft.com/office/word/2006/wordml" xmlns:wps="http://schemas.microsoft.com/office/word/2010/wordprocessingShape" mc:Ignorable="w14 w15 w16se w16cid w16 w16cex w16sdtdh w16sdtfl w16du wp14">
   <w:endnote w:type="separator" w:id="-1">
     <w:p>
       <w:pPr>
@@ -2978,7 +2300,7 @@
 </file>
 
 <file path=word/footer1.xml><?xml version="1.0" encoding="utf-8"?>
-<w:ftr xmlns:wpc="http://schemas.microsoft.com/office/word/2010/wordprocessingCanvas" xmlns:cx="http://schemas.microsoft.com/office/drawing/2014/chartex" xmlns:cx1="http://schemas.microsoft.com/office/drawing/2015/9/8/chartex" xmlns:cx2="http://schemas.microsoft.com/office/drawing/2015/10/21/chartex" xmlns:cx3="http://schemas.microsoft.com/office/drawing/2016/5/9/chartex" xmlns:cx4="http://schemas.microsoft.com/office/drawing/2016/5/10/chartex" xmlns:cx5="http://schemas.microsoft.com/office/drawing/2016/5/11/chartex" xmlns:cx6="http://schemas.microsoft.com/office/drawing/2016/5/12/chartex" xmlns:cx7="http://schemas.microsoft.com/office/drawing/2016/5/13/chartex" xmlns:cx8="http://schemas.microsoft.com/office/drawing/2016/5/14/chartex" xmlns:mc="http://schemas.openxmlformats.org/markup-compatibility/2006" xmlns:aink="http://schemas.microsoft.com/office/drawing/2016/ink" xmlns:am3d="http://schemas.microsoft.com/office/drawing/2017/model3d" xmlns:o="urn:schemas-microsoft-com:office:office" xmlns:oel="http://schemas.microsoft.com/office/2019/extlst" xmlns:r="http://schemas.openxmlformats.org/officeDocument/2006/relationships" xmlns:m="http://schemas.openxmlformats.org/officeDocument/2006/math" xmlns:v="urn:schemas-microsoft-com:vml" xmlns:wp14="http://schemas.microsoft.com/office/word/2010/wordprocessingDrawing" xmlns:wp="http://schemas.openxmlformats.org/drawingml/2006/wordprocessingDrawing" xmlns:w10="urn:schemas-microsoft-com:office:word" xmlns:w="http://schemas.openxmlformats.org/wordprocessingml/2006/main" xmlns:w14="http://schemas.microsoft.com/office/word/2010/wordml" xmlns:w15="http://schemas.microsoft.com/office/word/2012/wordml" xmlns:w16cex="http://schemas.microsoft.com/office/word/2018/wordml/cex" xmlns:w16cid="http://schemas.microsoft.com/office/word/2016/wordml/cid" xmlns:w16="http://schemas.microsoft.com/office/word/2018/wordml" xmlns:w16du="http://schemas.microsoft.com/office/word/2023/wordml/word16du" xmlns:w16sdtdh="http://schemas.microsoft.com/office/word/2020/wordml/sdtdatahash" xmlns:w16se="http://schemas.microsoft.com/office/word/2015/wordml/symex" xmlns:wpg="http://schemas.microsoft.com/office/word/2010/wordprocessingGroup" xmlns:wpi="http://schemas.microsoft.com/office/word/2010/wordprocessingInk" xmlns:wne="http://schemas.microsoft.com/office/word/2006/wordml" xmlns:wps="http://schemas.microsoft.com/office/word/2010/wordprocessingShape" mc:Ignorable="w14 w15 w16se w16cid w16 w16cex w16sdtdh w16du wp14">
+<w:ftr xmlns:wpc="http://schemas.microsoft.com/office/word/2010/wordprocessingCanvas" xmlns:cx="http://schemas.microsoft.com/office/drawing/2014/chartex" xmlns:cx1="http://schemas.microsoft.com/office/drawing/2015/9/8/chartex" xmlns:cx2="http://schemas.microsoft.com/office/drawing/2015/10/21/chartex" xmlns:cx3="http://schemas.microsoft.com/office/drawing/2016/5/9/chartex" xmlns:cx4="http://schemas.microsoft.com/office/drawing/2016/5/10/chartex" xmlns:cx5="http://schemas.microsoft.com/office/drawing/2016/5/11/chartex" xmlns:cx6="http://schemas.microsoft.com/office/drawing/2016/5/12/chartex" xmlns:cx7="http://schemas.microsoft.com/office/drawing/2016/5/13/chartex" xmlns:cx8="http://schemas.microsoft.com/office/drawing/2016/5/14/chartex" xmlns:mc="http://schemas.openxmlformats.org/markup-compatibility/2006" xmlns:aink="http://schemas.microsoft.com/office/drawing/2016/ink" xmlns:am3d="http://schemas.microsoft.com/office/drawing/2017/model3d" xmlns:o="urn:schemas-microsoft-com:office:office" xmlns:oel="http://schemas.microsoft.com/office/2019/extlst" xmlns:r="http://schemas.openxmlformats.org/officeDocument/2006/relationships" xmlns:m="http://schemas.openxmlformats.org/officeDocument/2006/math" xmlns:v="urn:schemas-microsoft-com:vml" xmlns:wp14="http://schemas.microsoft.com/office/word/2010/wordprocessingDrawing" xmlns:wp="http://schemas.openxmlformats.org/drawingml/2006/wordprocessingDrawing" xmlns:w10="urn:schemas-microsoft-com:office:word" xmlns:w="http://schemas.openxmlformats.org/wordprocessingml/2006/main" xmlns:w14="http://schemas.microsoft.com/office/word/2010/wordml" xmlns:w15="http://schemas.microsoft.com/office/word/2012/wordml" xmlns:w16cex="http://schemas.microsoft.com/office/word/2018/wordml/cex" xmlns:w16cid="http://schemas.microsoft.com/office/word/2016/wordml/cid" xmlns:w16="http://schemas.microsoft.com/office/word/2018/wordml" xmlns:w16du="http://schemas.microsoft.com/office/word/2023/wordml/word16du" xmlns:w16sdtdh="http://schemas.microsoft.com/office/word/2020/wordml/sdtdatahash" xmlns:w16sdtfl="http://schemas.microsoft.com/office/word/2024/wordml/sdtformatlock" xmlns:w16se="http://schemas.microsoft.com/office/word/2015/wordml/symex" xmlns:wpg="http://schemas.microsoft.com/office/word/2010/wordprocessingGroup" xmlns:wpi="http://schemas.microsoft.com/office/word/2010/wordprocessingInk" xmlns:wne="http://schemas.microsoft.com/office/word/2006/wordml" xmlns:wps="http://schemas.microsoft.com/office/word/2010/wordprocessingShape" mc:Ignorable="w14 w15 w16se w16cid w16 w16cex w16sdtdh w16sdtfl w16du wp14">
   <w:sdt>
     <w:sdtPr>
       <w:rPr>
@@ -3029,7 +2351,7 @@
 </file>
 
 <file path=word/footer2.xml><?xml version="1.0" encoding="utf-8"?>
-<w:ftr xmlns:wpc="http://schemas.microsoft.com/office/word/2010/wordprocessingCanvas" xmlns:cx="http://schemas.microsoft.com/office/drawing/2014/chartex" xmlns:cx1="http://schemas.microsoft.com/office/drawing/2015/9/8/chartex" xmlns:cx2="http://schemas.microsoft.com/office/drawing/2015/10/21/chartex" xmlns:cx3="http://schemas.microsoft.com/office/drawing/2016/5/9/chartex" xmlns:cx4="http://schemas.microsoft.com/office/drawing/2016/5/10/chartex" xmlns:cx5="http://schemas.microsoft.com/office/drawing/2016/5/11/chartex" xmlns:cx6="http://schemas.microsoft.com/office/drawing/2016/5/12/chartex" xmlns:cx7="http://schemas.microsoft.com/office/drawing/2016/5/13/chartex" xmlns:cx8="http://schemas.microsoft.com/office/drawing/2016/5/14/chartex" xmlns:mc="http://schemas.openxmlformats.org/markup-compatibility/2006" xmlns:aink="http://schemas.microsoft.com/office/drawing/2016/ink" xmlns:am3d="http://schemas.microsoft.com/office/drawing/2017/model3d" xmlns:o="urn:schemas-microsoft-com:office:office" xmlns:oel="http://schemas.microsoft.com/office/2019/extlst" xmlns:r="http://schemas.openxmlformats.org/officeDocument/2006/relationships" xmlns:m="http://schemas.openxmlformats.org/officeDocument/2006/math" xmlns:v="urn:schemas-microsoft-com:vml" xmlns:wp14="http://schemas.microsoft.com/office/word/2010/wordprocessingDrawing" xmlns:wp="http://schemas.openxmlformats.org/drawingml/2006/wordprocessingDrawing" xmlns:w10="urn:schemas-microsoft-com:office:word" xmlns:w="http://schemas.openxmlformats.org/wordprocessingml/2006/main" xmlns:w14="http://schemas.microsoft.com/office/word/2010/wordml" xmlns:w15="http://schemas.microsoft.com/office/word/2012/wordml" xmlns:w16cex="http://schemas.microsoft.com/office/word/2018/wordml/cex" xmlns:w16cid="http://schemas.microsoft.com/office/word/2016/wordml/cid" xmlns:w16="http://schemas.microsoft.com/office/word/2018/wordml" xmlns:w16du="http://schemas.microsoft.com/office/word/2023/wordml/word16du" xmlns:w16sdtdh="http://schemas.microsoft.com/office/word/2020/wordml/sdtdatahash" xmlns:w16se="http://schemas.microsoft.com/office/word/2015/wordml/symex" xmlns:wpg="http://schemas.microsoft.com/office/word/2010/wordprocessingGroup" xmlns:wpi="http://schemas.microsoft.com/office/word/2010/wordprocessingInk" xmlns:wne="http://schemas.microsoft.com/office/word/2006/wordml" xmlns:wps="http://schemas.microsoft.com/office/word/2010/wordprocessingShape" mc:Ignorable="w14 w15 w16se w16cid w16 w16cex w16sdtdh w16du wp14">
+<w:ftr xmlns:wpc="http://schemas.microsoft.com/office/word/2010/wordprocessingCanvas" xmlns:cx="http://schemas.microsoft.com/office/drawing/2014/chartex" xmlns:cx1="http://schemas.microsoft.com/office/drawing/2015/9/8/chartex" xmlns:cx2="http://schemas.microsoft.com/office/drawing/2015/10/21/chartex" xmlns:cx3="http://schemas.microsoft.com/office/drawing/2016/5/9/chartex" xmlns:cx4="http://schemas.microsoft.com/office/drawing/2016/5/10/chartex" xmlns:cx5="http://schemas.microsoft.com/office/drawing/2016/5/11/chartex" xmlns:cx6="http://schemas.microsoft.com/office/drawing/2016/5/12/chartex" xmlns:cx7="http://schemas.microsoft.com/office/drawing/2016/5/13/chartex" xmlns:cx8="http://schemas.microsoft.com/office/drawing/2016/5/14/chartex" xmlns:mc="http://schemas.openxmlformats.org/markup-compatibility/2006" xmlns:aink="http://schemas.microsoft.com/office/drawing/2016/ink" xmlns:am3d="http://schemas.microsoft.com/office/drawing/2017/model3d" xmlns:o="urn:schemas-microsoft-com:office:office" xmlns:oel="http://schemas.microsoft.com/office/2019/extlst" xmlns:r="http://schemas.openxmlformats.org/officeDocument/2006/relationships" xmlns:m="http://schemas.openxmlformats.org/officeDocument/2006/math" xmlns:v="urn:schemas-microsoft-com:vml" xmlns:wp14="http://schemas.microsoft.com/office/word/2010/wordprocessingDrawing" xmlns:wp="http://schemas.openxmlformats.org/drawingml/2006/wordprocessingDrawing" xmlns:w10="urn:schemas-microsoft-com:office:word" xmlns:w="http://schemas.openxmlformats.org/wordprocessingml/2006/main" xmlns:w14="http://schemas.microsoft.com/office/word/2010/wordml" xmlns:w15="http://schemas.microsoft.com/office/word/2012/wordml" xmlns:w16cex="http://schemas.microsoft.com/office/word/2018/wordml/cex" xmlns:w16cid="http://schemas.microsoft.com/office/word/2016/wordml/cid" xmlns:w16="http://schemas.microsoft.com/office/word/2018/wordml" xmlns:w16du="http://schemas.microsoft.com/office/word/2023/wordml/word16du" xmlns:w16sdtdh="http://schemas.microsoft.com/office/word/2020/wordml/sdtdatahash" xmlns:w16sdtfl="http://schemas.microsoft.com/office/word/2024/wordml/sdtformatlock" xmlns:w16se="http://schemas.microsoft.com/office/word/2015/wordml/symex" xmlns:wpg="http://schemas.microsoft.com/office/word/2010/wordprocessingGroup" xmlns:wpi="http://schemas.microsoft.com/office/word/2010/wordprocessingInk" xmlns:wne="http://schemas.microsoft.com/office/word/2006/wordml" xmlns:wps="http://schemas.microsoft.com/office/word/2010/wordprocessingShape" mc:Ignorable="w14 w15 w16se w16cid w16 w16cex w16sdtdh w16sdtfl w16du wp14">
   <w:sdt>
     <w:sdtPr>
       <w:rPr>
@@ -3093,7 +2415,7 @@
 </file>
 
 <file path=word/footnotes.xml><?xml version="1.0" encoding="utf-8"?>
-<w:footnotes xmlns:wpc="http://schemas.microsoft.com/office/word/2010/wordprocessingCanvas" xmlns:cx="http://schemas.microsoft.com/office/drawing/2014/chartex" xmlns:cx1="http://schemas.microsoft.com/office/drawing/2015/9/8/chartex" xmlns:cx2="http://schemas.microsoft.com/office/drawing/2015/10/21/chartex" xmlns:cx3="http://schemas.microsoft.com/office/drawing/2016/5/9/chartex" xmlns:cx4="http://schemas.microsoft.com/office/drawing/2016/5/10/chartex" xmlns:cx5="http://schemas.microsoft.com/office/drawing/2016/5/11/chartex" xmlns:cx6="http://schemas.microsoft.com/office/drawing/2016/5/12/chartex" xmlns:cx7="http://schemas.microsoft.com/office/drawing/2016/5/13/chartex" xmlns:cx8="http://schemas.microsoft.com/office/drawing/2016/5/14/chartex" xmlns:mc="http://schemas.openxmlformats.org/markup-compatibility/2006" xmlns:aink="http://schemas.microsoft.com/office/drawing/2016/ink" xmlns:am3d="http://schemas.microsoft.com/office/drawing/2017/model3d" xmlns:o="urn:schemas-microsoft-com:office:office" xmlns:oel="http://schemas.microsoft.com/office/2019/extlst" xmlns:r="http://schemas.openxmlformats.org/officeDocument/2006/relationships" xmlns:m="http://schemas.openxmlformats.org/officeDocument/2006/math" xmlns:v="urn:schemas-microsoft-com:vml" xmlns:wp14="http://schemas.microsoft.com/office/word/2010/wordprocessingDrawing" xmlns:wp="http://schemas.openxmlformats.org/drawingml/2006/wordprocessingDrawing" xmlns:w10="urn:schemas-microsoft-com:office:word" xmlns:w="http://schemas.openxmlformats.org/wordprocessingml/2006/main" xmlns:w14="http://schemas.microsoft.com/office/word/2010/wordml" xmlns:w15="http://schemas.microsoft.com/office/word/2012/wordml" xmlns:w16cex="http://schemas.microsoft.com/office/word/2018/wordml/cex" xmlns:w16cid="http://schemas.microsoft.com/office/word/2016/wordml/cid" xmlns:w16="http://schemas.microsoft.com/office/word/2018/wordml" xmlns:w16du="http://schemas.microsoft.com/office/word/2023/wordml/word16du" xmlns:w16sdtdh="http://schemas.microsoft.com/office/word/2020/wordml/sdtdatahash" xmlns:w16se="http://schemas.microsoft.com/office/word/2015/wordml/symex" xmlns:wpg="http://schemas.microsoft.com/office/word/2010/wordprocessingGroup" xmlns:wpi="http://schemas.microsoft.com/office/word/2010/wordprocessingInk" xmlns:wne="http://schemas.microsoft.com/office/word/2006/wordml" xmlns:wps="http://schemas.microsoft.com/office/word/2010/wordprocessingShape" mc:Ignorable="w14 w15 w16se w16cid w16 w16cex w16sdtdh w16du wp14">
+<w:footnotes xmlns:wpc="http://schemas.microsoft.com/office/word/2010/wordprocessingCanvas" xmlns:cx="http://schemas.microsoft.com/office/drawing/2014/chartex" xmlns:cx1="http://schemas.microsoft.com/office/drawing/2015/9/8/chartex" xmlns:cx2="http://schemas.microsoft.com/office/drawing/2015/10/21/chartex" xmlns:cx3="http://schemas.microsoft.com/office/drawing/2016/5/9/chartex" xmlns:cx4="http://schemas.microsoft.com/office/drawing/2016/5/10/chartex" xmlns:cx5="http://schemas.microsoft.com/office/drawing/2016/5/11/chartex" xmlns:cx6="http://schemas.microsoft.com/office/drawing/2016/5/12/chartex" xmlns:cx7="http://schemas.microsoft.com/office/drawing/2016/5/13/chartex" xmlns:cx8="http://schemas.microsoft.com/office/drawing/2016/5/14/chartex" xmlns:mc="http://schemas.openxmlformats.org/markup-compatibility/2006" xmlns:aink="http://schemas.microsoft.com/office/drawing/2016/ink" xmlns:am3d="http://schemas.microsoft.com/office/drawing/2017/model3d" xmlns:o="urn:schemas-microsoft-com:office:office" xmlns:oel="http://schemas.microsoft.com/office/2019/extlst" xmlns:r="http://schemas.openxmlformats.org/officeDocument/2006/relationships" xmlns:m="http://schemas.openxmlformats.org/officeDocument/2006/math" xmlns:v="urn:schemas-microsoft-com:vml" xmlns:wp14="http://schemas.microsoft.com/office/word/2010/wordprocessingDrawing" xmlns:wp="http://schemas.openxmlformats.org/drawingml/2006/wordprocessingDrawing" xmlns:w10="urn:schemas-microsoft-com:office:word" xmlns:w="http://schemas.openxmlformats.org/wordprocessingml/2006/main" xmlns:w14="http://schemas.microsoft.com/office/word/2010/wordml" xmlns:w15="http://schemas.microsoft.com/office/word/2012/wordml" xmlns:w16cex="http://schemas.microsoft.com/office/word/2018/wordml/cex" xmlns:w16cid="http://schemas.microsoft.com/office/word/2016/wordml/cid" xmlns:w16="http://schemas.microsoft.com/office/word/2018/wordml" xmlns:w16du="http://schemas.microsoft.com/office/word/2023/wordml/word16du" xmlns:w16sdtdh="http://schemas.microsoft.com/office/word/2020/wordml/sdtdatahash" xmlns:w16sdtfl="http://schemas.microsoft.com/office/word/2024/wordml/sdtformatlock" xmlns:w16se="http://schemas.microsoft.com/office/word/2015/wordml/symex" xmlns:wpg="http://schemas.microsoft.com/office/word/2010/wordprocessingGroup" xmlns:wpi="http://schemas.microsoft.com/office/word/2010/wordprocessingInk" xmlns:wne="http://schemas.microsoft.com/office/word/2006/wordml" xmlns:wps="http://schemas.microsoft.com/office/word/2010/wordprocessingShape" mc:Ignorable="w14 w15 w16se w16cid w16 w16cex w16sdtdh w16sdtfl w16du wp14">
   <w:footnote w:type="separator" w:id="-1">
     <w:p>
       <w:pPr>
@@ -3118,7 +2440,7 @@
 </file>
 
 <file path=word/numbering.xml><?xml version="1.0" encoding="utf-8"?>
-<w:numbering xmlns:wpc="http://schemas.microsoft.com/office/word/2010/wordprocessingCanvas" xmlns:cx="http://schemas.microsoft.com/office/drawing/2014/chartex" xmlns:cx1="http://schemas.microsoft.com/office/drawing/2015/9/8/chartex" xmlns:cx2="http://schemas.microsoft.com/office/drawing/2015/10/21/chartex" xmlns:cx3="http://schemas.microsoft.com/office/drawing/2016/5/9/chartex" xmlns:cx4="http://schemas.microsoft.com/office/drawing/2016/5/10/chartex" xmlns:cx5="http://schemas.microsoft.com/office/drawing/2016/5/11/chartex" xmlns:cx6="http://schemas.microsoft.com/office/drawing/2016/5/12/chartex" xmlns:cx7="http://schemas.microsoft.com/office/drawing/2016/5/13/chartex" xmlns:cx8="http://schemas.microsoft.com/office/drawing/2016/5/14/chartex" xmlns:mc="http://schemas.openxmlformats.org/markup-compatibility/2006" xmlns:aink="http://schemas.microsoft.com/office/drawing/2016/ink" xmlns:am3d="http://schemas.microsoft.com/office/drawing/2017/model3d" xmlns:o="urn:schemas-microsoft-com:office:office" xmlns:oel="http://schemas.microsoft.com/office/2019/extlst" xmlns:r="http://schemas.openxmlformats.org/officeDocument/2006/relationships" xmlns:m="http://schemas.openxmlformats.org/officeDocument/2006/math" xmlns:v="urn:schemas-microsoft-com:vml" xmlns:wp14="http://schemas.microsoft.com/office/word/2010/wordprocessingDrawing" xmlns:wp="http://schemas.openxmlformats.org/drawingml/2006/wordprocessingDrawing" xmlns:w10="urn:schemas-microsoft-com:office:word" xmlns:w="http://schemas.openxmlformats.org/wordprocessingml/2006/main" xmlns:w14="http://schemas.microsoft.com/office/word/2010/wordml" xmlns:w15="http://schemas.microsoft.com/office/word/2012/wordml" xmlns:w16cex="http://schemas.microsoft.com/office/word/2018/wordml/cex" xmlns:w16cid="http://schemas.microsoft.com/office/word/2016/wordml/cid" xmlns:w16="http://schemas.microsoft.com/office/word/2018/wordml" xmlns:w16du="http://schemas.microsoft.com/office/word/2023/wordml/word16du" xmlns:w16sdtdh="http://schemas.microsoft.com/office/word/2020/wordml/sdtdatahash" xmlns:w16se="http://schemas.microsoft.com/office/word/2015/wordml/symex" xmlns:wpg="http://schemas.microsoft.com/office/word/2010/wordprocessingGroup" xmlns:wpi="http://schemas.microsoft.com/office/word/2010/wordprocessingInk" xmlns:wne="http://schemas.microsoft.com/office/word/2006/wordml" xmlns:wps="http://schemas.microsoft.com/office/word/2010/wordprocessingShape" mc:Ignorable="w14 w15 w16se w16cid w16 w16cex w16sdtdh w16du wp14">
+<w:numbering xmlns:wpc="http://schemas.microsoft.com/office/word/2010/wordprocessingCanvas" xmlns:cx="http://schemas.microsoft.com/office/drawing/2014/chartex" xmlns:cx1="http://schemas.microsoft.com/office/drawing/2015/9/8/chartex" xmlns:cx2="http://schemas.microsoft.com/office/drawing/2015/10/21/chartex" xmlns:cx3="http://schemas.microsoft.com/office/drawing/2016/5/9/chartex" xmlns:cx4="http://schemas.microsoft.com/office/drawing/2016/5/10/chartex" xmlns:cx5="http://schemas.microsoft.com/office/drawing/2016/5/11/chartex" xmlns:cx6="http://schemas.microsoft.com/office/drawing/2016/5/12/chartex" xmlns:cx7="http://schemas.microsoft.com/office/drawing/2016/5/13/chartex" xmlns:cx8="http://schemas.microsoft.com/office/drawing/2016/5/14/chartex" xmlns:mc="http://schemas.openxmlformats.org/markup-compatibility/2006" xmlns:aink="http://schemas.microsoft.com/office/drawing/2016/ink" xmlns:am3d="http://schemas.microsoft.com/office/drawing/2017/model3d" xmlns:o="urn:schemas-microsoft-com:office:office" xmlns:oel="http://schemas.microsoft.com/office/2019/extlst" xmlns:r="http://schemas.openxmlformats.org/officeDocument/2006/relationships" xmlns:m="http://schemas.openxmlformats.org/officeDocument/2006/math" xmlns:v="urn:schemas-microsoft-com:vml" xmlns:wp14="http://schemas.microsoft.com/office/word/2010/wordprocessingDrawing" xmlns:wp="http://schemas.openxmlformats.org/drawingml/2006/wordprocessingDrawing" xmlns:w10="urn:schemas-microsoft-com:office:word" xmlns:w="http://schemas.openxmlformats.org/wordprocessingml/2006/main" xmlns:w14="http://schemas.microsoft.com/office/word/2010/wordml" xmlns:w15="http://schemas.microsoft.com/office/word/2012/wordml" xmlns:w16cex="http://schemas.microsoft.com/office/word/2018/wordml/cex" xmlns:w16cid="http://schemas.microsoft.com/office/word/2016/wordml/cid" xmlns:w16="http://schemas.microsoft.com/office/word/2018/wordml" xmlns:w16du="http://schemas.microsoft.com/office/word/2023/wordml/word16du" xmlns:w16sdtdh="http://schemas.microsoft.com/office/word/2020/wordml/sdtdatahash" xmlns:w16sdtfl="http://schemas.microsoft.com/office/word/2024/wordml/sdtformatlock" xmlns:w16se="http://schemas.microsoft.com/office/word/2015/wordml/symex" xmlns:wpg="http://schemas.microsoft.com/office/word/2010/wordprocessingGroup" xmlns:wpi="http://schemas.microsoft.com/office/word/2010/wordprocessingInk" xmlns:wne="http://schemas.microsoft.com/office/word/2006/wordml" xmlns:wps="http://schemas.microsoft.com/office/word/2010/wordprocessingShape" mc:Ignorable="w14 w15 w16se w16cid w16 w16cex w16sdtdh w16sdtfl w16du wp14">
   <w:abstractNum w:abstractNumId="0" w15:restartNumberingAfterBreak="0">
     <w:nsid w:val="0BDA4F7B"/>
     <w:multiLevelType w:val="hybridMultilevel"/>
@@ -3358,7 +2680,7 @@
 </file>
 
 <file path=word/styles.xml><?xml version="1.0" encoding="utf-8"?>
-<w:styles xmlns:mc="http://schemas.openxmlformats.org/markup-compatibility/2006" xmlns:r="http://schemas.openxmlformats.org/officeDocument/2006/relationships" xmlns:w="http://schemas.openxmlformats.org/wordprocessingml/2006/main" xmlns:w14="http://schemas.microsoft.com/office/word/2010/wordml" xmlns:w15="http://schemas.microsoft.com/office/word/2012/wordml" xmlns:w16cex="http://schemas.microsoft.com/office/word/2018/wordml/cex" xmlns:w16cid="http://schemas.microsoft.com/office/word/2016/wordml/cid" xmlns:w16="http://schemas.microsoft.com/office/word/2018/wordml" xmlns:w16du="http://schemas.microsoft.com/office/word/2023/wordml/word16du" xmlns:w16sdtdh="http://schemas.microsoft.com/office/word/2020/wordml/sdtdatahash" xmlns:w16se="http://schemas.microsoft.com/office/word/2015/wordml/symex" mc:Ignorable="w14 w15 w16se w16cid w16 w16cex w16sdtdh w16du">
+<w:styles xmlns:mc="http://schemas.openxmlformats.org/markup-compatibility/2006" xmlns:r="http://schemas.openxmlformats.org/officeDocument/2006/relationships" xmlns:w="http://schemas.openxmlformats.org/wordprocessingml/2006/main" xmlns:w14="http://schemas.microsoft.com/office/word/2010/wordml" xmlns:w15="http://schemas.microsoft.com/office/word/2012/wordml" xmlns:w16cex="http://schemas.microsoft.com/office/word/2018/wordml/cex" xmlns:w16cid="http://schemas.microsoft.com/office/word/2016/wordml/cid" xmlns:w16="http://schemas.microsoft.com/office/word/2018/wordml" xmlns:w16du="http://schemas.microsoft.com/office/word/2023/wordml/word16du" xmlns:w16sdtdh="http://schemas.microsoft.com/office/word/2020/wordml/sdtdatahash" xmlns:w16sdtfl="http://schemas.microsoft.com/office/word/2024/wordml/sdtformatlock" xmlns:w16se="http://schemas.microsoft.com/office/word/2015/wordml/symex" mc:Ignorable="w14 w15 w16se w16cid w16 w16cex w16sdtdh w16sdtfl w16du">
   <w:docDefaults>
     <w:rPrDefault>
       <w:rPr>
@@ -3757,9 +3079,13 @@
   <w:style w:type="paragraph" w:default="1" w:styleId="Normal">
     <w:name w:val="Normal"/>
     <w:qFormat/>
-    <w:rsid w:val="00C36E31"/>
+    <w:rsid w:val="00B150CC"/>
+    <w:pPr>
+      <w:jc w:val="both"/>
+    </w:pPr>
     <w:rPr>
       <w:rFonts w:ascii="Times New Roman" w:hAnsi="Times New Roman"/>
+      <w:sz w:val="24"/>
     </w:rPr>
   </w:style>
   <w:style w:type="paragraph" w:styleId="Heading1">
@@ -3788,20 +3114,23 @@
     <w:basedOn w:val="Normal"/>
     <w:next w:val="Normal"/>
     <w:link w:val="Heading2Char"/>
+    <w:autoRedefine/>
     <w:uiPriority w:val="9"/>
     <w:unhideWhenUsed/>
     <w:qFormat/>
-    <w:rsid w:val="00197F6B"/>
+    <w:rsid w:val="00831A36"/>
     <w:pPr>
       <w:keepNext/>
       <w:keepLines/>
       <w:spacing w:before="40" w:after="0"/>
+      <w:jc w:val="left"/>
       <w:outlineLvl w:val="1"/>
     </w:pPr>
     <w:rPr>
-      <w:rFonts w:asciiTheme="majorHAnsi" w:eastAsiaTheme="majorEastAsia" w:hAnsiTheme="majorHAnsi" w:cstheme="majorBidi"/>
-      <w:color w:val="2F5496" w:themeColor="accent1" w:themeShade="BF"/>
-      <w:sz w:val="26"/>
+      <w:rFonts w:eastAsiaTheme="majorEastAsia" w:cstheme="majorBidi"/>
+      <w:b/>
+      <w:color w:val="000000" w:themeColor="text1"/>
+      <w:sz w:val="28"/>
       <w:szCs w:val="26"/>
     </w:rPr>
   </w:style>
@@ -3823,7 +3152,6 @@
     <w:rPr>
       <w:rFonts w:asciiTheme="majorHAnsi" w:eastAsiaTheme="majorEastAsia" w:hAnsiTheme="majorHAnsi" w:cstheme="majorBidi"/>
       <w:color w:val="1F3763" w:themeColor="accent1" w:themeShade="7F"/>
-      <w:sz w:val="24"/>
       <w:szCs w:val="24"/>
     </w:rPr>
   </w:style>
@@ -3916,11 +3244,12 @@
     <w:basedOn w:val="DefaultParagraphFont"/>
     <w:link w:val="Heading2"/>
     <w:uiPriority w:val="9"/>
-    <w:rsid w:val="00197F6B"/>
+    <w:rsid w:val="00831A36"/>
     <w:rPr>
-      <w:rFonts w:asciiTheme="majorHAnsi" w:eastAsiaTheme="majorEastAsia" w:hAnsiTheme="majorHAnsi" w:cstheme="majorBidi"/>
-      <w:color w:val="2F5496" w:themeColor="accent1" w:themeShade="BF"/>
-      <w:sz w:val="26"/>
+      <w:rFonts w:ascii="Times New Roman" w:eastAsiaTheme="majorEastAsia" w:hAnsi="Times New Roman" w:cstheme="majorBidi"/>
+      <w:b/>
+      <w:color w:val="000000" w:themeColor="text1"/>
+      <w:sz w:val="28"/>
       <w:szCs w:val="26"/>
     </w:rPr>
   </w:style>
@@ -4025,19 +3354,20 @@
     <w:name w:val="caption"/>
     <w:basedOn w:val="Normal"/>
     <w:next w:val="Normal"/>
+    <w:autoRedefine/>
     <w:uiPriority w:val="35"/>
     <w:unhideWhenUsed/>
     <w:qFormat/>
-    <w:rsid w:val="0091118C"/>
+    <w:rsid w:val="00FB6254"/>
     <w:pPr>
+      <w:keepNext/>
       <w:spacing w:after="200" w:line="240" w:lineRule="auto"/>
+      <w:ind w:left="1530" w:hanging="1440"/>
+      <w:jc w:val="left"/>
     </w:pPr>
     <w:rPr>
-      <w:i/>
-      <w:iCs/>
-      <w:color w:val="44546A" w:themeColor="text2"/>
-      <w:sz w:val="18"/>
-      <w:szCs w:val="18"/>
+      <w:sz w:val="22"/>
+      <w:szCs w:val="24"/>
     </w:rPr>
   </w:style>
   <w:style w:type="paragraph" w:styleId="NormalWeb">
@@ -4052,7 +3382,6 @@
     <w:rPr>
       <w:rFonts w:eastAsia="Times New Roman" w:cs="Times New Roman"/>
       <w:kern w:val="0"/>
-      <w:sz w:val="24"/>
       <w:szCs w:val="24"/>
     </w:rPr>
   </w:style>

</xml_diff>